<commit_message>
nmv 11 10 2026
</commit_message>
<xml_diff>
--- a/TS Jatai Ghanam Project/TS 4.2/TS 4.2 Ghanam Malayalam Corrections.docx
+++ b/TS Jatai Ghanam Project/TS 4.2/TS 4.2 Ghanam Malayalam Corrections.docx
@@ -1,6 +1,6 @@
 
 <file path=word/document.xml><?xml version="1.0" encoding="utf-8"?>
-<w:document xmlns:wpc="http://schemas.microsoft.com/office/word/2010/wordprocessingCanvas" xmlns:cx="http://schemas.microsoft.com/office/drawing/2014/chartex" xmlns:cx1="http://schemas.microsoft.com/office/drawing/2015/9/8/chartex" xmlns:cx2="http://schemas.microsoft.com/office/drawing/2015/10/21/chartex" xmlns:cx3="http://schemas.microsoft.com/office/drawing/2016/5/9/chartex" xmlns:cx4="http://schemas.microsoft.com/office/drawing/2016/5/10/chartex" xmlns:cx5="http://schemas.microsoft.com/office/drawing/2016/5/11/chartex" xmlns:cx6="http://schemas.microsoft.com/office/drawing/2016/5/12/chartex" xmlns:cx7="http://schemas.microsoft.com/office/drawing/2016/5/13/chartex" xmlns:cx8="http://schemas.microsoft.com/office/drawing/2016/5/14/chartex" xmlns:mc="http://schemas.openxmlformats.org/markup-compatibility/2006" xmlns:aink="http://schemas.microsoft.com/office/drawing/2016/ink" xmlns:am3d="http://schemas.microsoft.com/office/drawing/2017/model3d" xmlns:o="urn:schemas-microsoft-com:office:office" xmlns:oel="http://schemas.microsoft.com/office/2019/extlst" xmlns:r="http://schemas.openxmlformats.org/officeDocument/2006/relationships" xmlns:m="http://schemas.openxmlformats.org/officeDocument/2006/math" xmlns:v="urn:schemas-microsoft-com:vml" xmlns:wp14="http://schemas.microsoft.com/office/word/2010/wordprocessingDrawing" xmlns:wp="http://schemas.openxmlformats.org/drawingml/2006/wordprocessingDrawing" xmlns:w10="urn:schemas-microsoft-com:office:word" xmlns:w="http://schemas.openxmlformats.org/wordprocessingml/2006/main" xmlns:w14="http://schemas.microsoft.com/office/word/2010/wordml" xmlns:w15="http://schemas.microsoft.com/office/word/2012/wordml" xmlns:w16cex="http://schemas.microsoft.com/office/word/2018/wordml/cex" xmlns:w16cid="http://schemas.microsoft.com/office/word/2016/wordml/cid" xmlns:w16="http://schemas.microsoft.com/office/word/2018/wordml" xmlns:w16sdtdh="http://schemas.microsoft.com/office/word/2020/wordml/sdtdatahash" xmlns:w16se="http://schemas.microsoft.com/office/word/2015/wordml/symex" xmlns:wpg="http://schemas.microsoft.com/office/word/2010/wordprocessingGroup" xmlns:wpi="http://schemas.microsoft.com/office/word/2010/wordprocessingInk" xmlns:wne="http://schemas.microsoft.com/office/word/2006/wordml" xmlns:wps="http://schemas.microsoft.com/office/word/2010/wordprocessingShape" mc:Ignorable="w14 w15 w16se w16cid w16 w16cex w16sdtdh wp14">
+<w:document xmlns:wpc="http://schemas.microsoft.com/office/word/2010/wordprocessingCanvas" xmlns:cx="http://schemas.microsoft.com/office/drawing/2014/chartex" xmlns:cx1="http://schemas.microsoft.com/office/drawing/2015/9/8/chartex" xmlns:cx2="http://schemas.microsoft.com/office/drawing/2015/10/21/chartex" xmlns:cx3="http://schemas.microsoft.com/office/drawing/2016/5/9/chartex" xmlns:cx4="http://schemas.microsoft.com/office/drawing/2016/5/10/chartex" xmlns:cx5="http://schemas.microsoft.com/office/drawing/2016/5/11/chartex" xmlns:cx6="http://schemas.microsoft.com/office/drawing/2016/5/12/chartex" xmlns:cx7="http://schemas.microsoft.com/office/drawing/2016/5/13/chartex" xmlns:cx8="http://schemas.microsoft.com/office/drawing/2016/5/14/chartex" xmlns:mc="http://schemas.openxmlformats.org/markup-compatibility/2006" xmlns:aink="http://schemas.microsoft.com/office/drawing/2016/ink" xmlns:am3d="http://schemas.microsoft.com/office/drawing/2017/model3d" xmlns:o="urn:schemas-microsoft-com:office:office" xmlns:oel="http://schemas.microsoft.com/office/2019/extlst" xmlns:r="http://schemas.openxmlformats.org/officeDocument/2006/relationships" xmlns:m="http://schemas.openxmlformats.org/officeDocument/2006/math" xmlns:v="urn:schemas-microsoft-com:vml" xmlns:wp14="http://schemas.microsoft.com/office/word/2010/wordprocessingDrawing" xmlns:wp="http://schemas.openxmlformats.org/drawingml/2006/wordprocessingDrawing" xmlns:w10="urn:schemas-microsoft-com:office:word" xmlns:w="http://schemas.openxmlformats.org/wordprocessingml/2006/main" xmlns:w14="http://schemas.microsoft.com/office/word/2010/wordml" xmlns:w15="http://schemas.microsoft.com/office/word/2012/wordml" xmlns:w16cex="http://schemas.microsoft.com/office/word/2018/wordml/cex" xmlns:w16cid="http://schemas.microsoft.com/office/word/2016/wordml/cid" xmlns:w16="http://schemas.microsoft.com/office/word/2018/wordml" xmlns:w16du="http://schemas.microsoft.com/office/word/2023/wordml/word16du" xmlns:w16sdtdh="http://schemas.microsoft.com/office/word/2020/wordml/sdtdatahash" xmlns:w16sdtfl="http://schemas.microsoft.com/office/word/2024/wordml/sdtformatlock" xmlns:w16se="http://schemas.microsoft.com/office/word/2015/wordml/symex" xmlns:wpg="http://schemas.microsoft.com/office/word/2010/wordprocessingGroup" xmlns:wpi="http://schemas.microsoft.com/office/word/2010/wordprocessingInk" xmlns:wne="http://schemas.microsoft.com/office/word/2006/wordml" xmlns:wps="http://schemas.microsoft.com/office/word/2010/wordprocessingShape" mc:Ignorable="w14 w15 w16se w16cid w16 w16cex w16sdtdh w16sdtfl w16du wp14">
   <w:body>
     <w:p>
       <w:pPr>
@@ -24,6 +24,359 @@
         </w:rPr>
         <w:t xml:space="preserve">TS </w:t>
       </w:r>
+      <w:r>
+        <w:rPr>
+          <w:b/>
+          <w:bCs/>
+          <w:sz w:val="32"/>
+          <w:szCs w:val="32"/>
+          <w:u w:val="single"/>
+        </w:rPr>
+        <w:t xml:space="preserve">Ghanam </w:t>
+      </w:r>
+      <w:r>
+        <w:rPr>
+          <w:b/>
+          <w:bCs/>
+          <w:sz w:val="32"/>
+          <w:szCs w:val="32"/>
+          <w:u w:val="single"/>
+        </w:rPr>
+        <w:t xml:space="preserve"> </w:t>
+      </w:r>
+      <w:r>
+        <w:rPr>
+          <w:b/>
+          <w:bCs/>
+          <w:sz w:val="32"/>
+          <w:szCs w:val="32"/>
+          <w:u w:val="single"/>
+        </w:rPr>
+        <w:t xml:space="preserve">– TS </w:t>
+      </w:r>
+      <w:r>
+        <w:rPr>
+          <w:b/>
+          <w:bCs/>
+          <w:sz w:val="32"/>
+          <w:szCs w:val="32"/>
+          <w:u w:val="single"/>
+        </w:rPr>
+        <w:t>4.2</w:t>
+      </w:r>
+      <w:r>
+        <w:rPr>
+          <w:b/>
+          <w:bCs/>
+          <w:sz w:val="32"/>
+          <w:szCs w:val="32"/>
+          <w:u w:val="single"/>
+        </w:rPr>
+        <w:t xml:space="preserve"> </w:t>
+      </w:r>
+      <w:r>
+        <w:rPr>
+          <w:b/>
+          <w:bCs/>
+          <w:sz w:val="32"/>
+          <w:szCs w:val="32"/>
+          <w:u w:val="single"/>
+        </w:rPr>
+        <w:t>Malayalam</w:t>
+      </w:r>
+      <w:r>
+        <w:rPr>
+          <w:b/>
+          <w:bCs/>
+          <w:sz w:val="32"/>
+          <w:szCs w:val="32"/>
+          <w:u w:val="single"/>
+        </w:rPr>
+        <w:t xml:space="preserve"> Corrections –</w:t>
+      </w:r>
+      <w:r>
+        <w:rPr>
+          <w:b/>
+          <w:bCs/>
+          <w:sz w:val="32"/>
+          <w:szCs w:val="32"/>
+          <w:u w:val="single"/>
+        </w:rPr>
+        <w:t xml:space="preserve"> </w:t>
+      </w:r>
+      <w:r>
+        <w:rPr>
+          <w:b/>
+          <w:bCs/>
+          <w:sz w:val="32"/>
+          <w:szCs w:val="32"/>
+          <w:u w:val="single"/>
+        </w:rPr>
+        <w:t xml:space="preserve">Observed till </w:t>
+      </w:r>
+      <w:r>
+        <w:rPr>
+          <w:b/>
+          <w:bCs/>
+          <w:sz w:val="32"/>
+          <w:szCs w:val="32"/>
+          <w:u w:val="single"/>
+        </w:rPr>
+        <w:t>31st Oct 2026</w:t>
+      </w:r>
+    </w:p>
+    <w:p>
+      <w:pPr>
+        <w:spacing w:before="0" w:line="240" w:lineRule="auto"/>
+        <w:jc w:val="center"/>
+        <w:rPr>
+          <w:b/>
+          <w:bCs/>
+          <w:sz w:val="28"/>
+          <w:szCs w:val="32"/>
+        </w:rPr>
+      </w:pPr>
+      <w:r>
+        <w:rPr>
+          <w:b/>
+          <w:bCs/>
+          <w:sz w:val="28"/>
+          <w:szCs w:val="32"/>
+        </w:rPr>
+        <w:t>(ignore those which are already incorporated in your book’s version and date)</w:t>
+      </w:r>
+    </w:p>
+    <w:tbl>
+      <w:tblPr>
+        <w:tblW w:w="14537" w:type="dxa"/>
+        <w:tblInd w:w="-792" w:type="dxa"/>
+        <w:tblBorders>
+          <w:top w:val="single" w:sz="4" w:space="0" w:color="000000"/>
+          <w:left w:val="single" w:sz="4" w:space="0" w:color="000000"/>
+          <w:bottom w:val="single" w:sz="4" w:space="0" w:color="000000"/>
+          <w:right w:val="single" w:sz="4" w:space="0" w:color="000000"/>
+          <w:insideH w:val="single" w:sz="4" w:space="0" w:color="000000"/>
+          <w:insideV w:val="single" w:sz="4" w:space="0" w:color="000000"/>
+        </w:tblBorders>
+        <w:tblLook w:val="04A0" w:firstRow="1" w:lastRow="0" w:firstColumn="1" w:lastColumn="0" w:noHBand="0" w:noVBand="1"/>
+      </w:tblPr>
+      <w:tblGrid>
+        <w:gridCol w:w="7166"/>
+        <w:gridCol w:w="7371"/>
+      </w:tblGrid>
+      <w:tr>
+        <w:tc>
+          <w:tcPr>
+            <w:tcW w:w="7166" w:type="dxa"/>
+          </w:tcPr>
+          <w:p>
+            <w:pPr>
+              <w:spacing w:before="0" w:line="240" w:lineRule="auto"/>
+              <w:jc w:val="center"/>
+              <w:rPr>
+                <w:b/>
+                <w:sz w:val="32"/>
+                <w:szCs w:val="32"/>
+              </w:rPr>
+            </w:pPr>
+            <w:r>
+              <w:rPr>
+                <w:b/>
+                <w:sz w:val="32"/>
+                <w:szCs w:val="32"/>
+              </w:rPr>
+              <w:t>As Printed</w:t>
+            </w:r>
+          </w:p>
+        </w:tc>
+        <w:tc>
+          <w:tcPr>
+            <w:tcW w:w="7371" w:type="dxa"/>
+          </w:tcPr>
+          <w:p>
+            <w:pPr>
+              <w:spacing w:before="0" w:line="240" w:lineRule="auto"/>
+              <w:ind w:right="-18"/>
+              <w:jc w:val="center"/>
+              <w:rPr>
+                <w:b/>
+                <w:sz w:val="32"/>
+                <w:szCs w:val="32"/>
+              </w:rPr>
+            </w:pPr>
+            <w:r>
+              <w:rPr>
+                <w:b/>
+                <w:sz w:val="32"/>
+                <w:szCs w:val="32"/>
+              </w:rPr>
+              <w:t>To be read as or corrected as</w:t>
+            </w:r>
+            <w:r>
+              <w:rPr>
+                <w:b/>
+                <w:sz w:val="32"/>
+                <w:szCs w:val="32"/>
+              </w:rPr>
+              <w:t xml:space="preserve"> </w:t>
+            </w:r>
+          </w:p>
+        </w:tc>
+      </w:tr>
+      <w:tr>
+        <w:trPr>
+          <w:trHeight w:val="488"/>
+        </w:trPr>
+        <w:tc>
+          <w:tcPr>
+            <w:tcW w:w="7166" w:type="dxa"/>
+            <w:tcBorders>
+              <w:top w:val="single" w:sz="4" w:space="0" w:color="000000"/>
+              <w:left w:val="single" w:sz="4" w:space="0" w:color="000000"/>
+              <w:bottom w:val="single" w:sz="4" w:space="0" w:color="000000"/>
+              <w:right w:val="single" w:sz="4" w:space="0" w:color="000000"/>
+            </w:tcBorders>
+          </w:tcPr>
+          <w:p>
+            <w:pPr>
+              <w:widowControl w:val="0"/>
+              <w:autoSpaceDE w:val="0"/>
+              <w:autoSpaceDN w:val="0"/>
+              <w:adjustRightInd w:val="0"/>
+              <w:spacing w:before="0" w:line="240" w:lineRule="auto"/>
+              <w:jc w:val="center"/>
+              <w:rPr>
+                <w:rFonts w:cs="BRH Malayalam Extra"/>
+                <w:b/>
+                <w:bCs/>
+                <w:szCs w:val="40"/>
+              </w:rPr>
+            </w:pPr>
+            <w:r>
+              <w:rPr>
+                <w:rFonts w:cs="BRH Malayalam Extra"/>
+                <w:b/>
+                <w:bCs/>
+                <w:szCs w:val="40"/>
+                <w:lang w:val="it-IT"/>
+              </w:rPr>
+              <w:t xml:space="preserve">None, None. None, None, None. </w:t>
+            </w:r>
+            <w:r>
+              <w:rPr>
+                <w:rFonts w:cs="BRH Malayalam Extra"/>
+                <w:b/>
+                <w:bCs/>
+                <w:szCs w:val="40"/>
+              </w:rPr>
+              <w:t>None</w:t>
+            </w:r>
+          </w:p>
+        </w:tc>
+        <w:tc>
+          <w:tcPr>
+            <w:tcW w:w="7371" w:type="dxa"/>
+            <w:tcBorders>
+              <w:top w:val="single" w:sz="4" w:space="0" w:color="000000"/>
+              <w:left w:val="single" w:sz="4" w:space="0" w:color="000000"/>
+              <w:bottom w:val="single" w:sz="4" w:space="0" w:color="000000"/>
+              <w:right w:val="single" w:sz="4" w:space="0" w:color="000000"/>
+            </w:tcBorders>
+          </w:tcPr>
+          <w:p>
+            <w:pPr>
+              <w:widowControl w:val="0"/>
+              <w:autoSpaceDE w:val="0"/>
+              <w:autoSpaceDN w:val="0"/>
+              <w:adjustRightInd w:val="0"/>
+              <w:spacing w:before="0" w:line="240" w:lineRule="auto"/>
+              <w:rPr>
+                <w:rFonts w:cs="BRH Malayalam Extra"/>
+                <w:szCs w:val="40"/>
+              </w:rPr>
+            </w:pPr>
+            <w:r>
+              <w:rPr>
+                <w:rFonts w:cs="BRH Malayalam Extra"/>
+                <w:b/>
+                <w:bCs/>
+                <w:szCs w:val="40"/>
+                <w:lang w:val="it-IT"/>
+              </w:rPr>
+              <w:t xml:space="preserve">None, None. None, None, None. </w:t>
+            </w:r>
+            <w:r>
+              <w:rPr>
+                <w:rFonts w:cs="BRH Malayalam Extra"/>
+                <w:b/>
+                <w:bCs/>
+                <w:szCs w:val="40"/>
+              </w:rPr>
+              <w:t>None</w:t>
+            </w:r>
+          </w:p>
+        </w:tc>
+      </w:tr>
+    </w:tbl>
+    <w:p>
+      <w:pPr>
+        <w:spacing w:before="0" w:line="240" w:lineRule="auto"/>
+        <w:jc w:val="center"/>
+        <w:rPr>
+          <w:b/>
+          <w:bCs/>
+          <w:sz w:val="32"/>
+          <w:szCs w:val="32"/>
+          <w:u w:val="single"/>
+        </w:rPr>
+      </w:pPr>
+      <w:r>
+        <w:rPr>
+          <w:b/>
+          <w:bCs/>
+          <w:sz w:val="32"/>
+          <w:szCs w:val="32"/>
+          <w:u w:val="single"/>
+        </w:rPr>
+        <w:t>===============</w:t>
+      </w:r>
+    </w:p>
+    <w:p>
+      <w:pPr>
+        <w:spacing w:before="0" w:line="240" w:lineRule="auto"/>
+        <w:jc w:val="center"/>
+        <w:rPr>
+          <w:b/>
+          <w:bCs/>
+          <w:sz w:val="32"/>
+          <w:szCs w:val="32"/>
+          <w:u w:val="single"/>
+        </w:rPr>
+      </w:pPr>
+    </w:p>
+    <w:p>
+      <w:pPr>
+        <w:spacing w:before="0" w:line="240" w:lineRule="auto"/>
+        <w:jc w:val="center"/>
+        <w:rPr>
+          <w:b/>
+          <w:bCs/>
+          <w:sz w:val="32"/>
+          <w:szCs w:val="32"/>
+          <w:u w:val="single"/>
+        </w:rPr>
+      </w:pPr>
+      <w:r>
+        <w:rPr>
+          <w:b/>
+          <w:bCs/>
+          <w:sz w:val="32"/>
+          <w:szCs w:val="32"/>
+          <w:u w:val="single"/>
+        </w:rPr>
+        <w:t xml:space="preserve">TS </w:t>
+      </w:r>
+      <w:proofErr w:type="gramStart"/>
       <w:r>
         <w:rPr>
           <w:b/>
@@ -62,7 +415,18 @@
           <w:szCs w:val="32"/>
           <w:u w:val="single"/>
         </w:rPr>
-        <w:t xml:space="preserve">– TS </w:t>
+        <w:t>–</w:t>
+      </w:r>
+      <w:proofErr w:type="gramEnd"/>
+      <w:r>
+        <w:rPr>
+          <w:b/>
+          <w:bCs/>
+          <w:sz w:val="32"/>
+          <w:szCs w:val="32"/>
+          <w:u w:val="single"/>
+        </w:rPr>
+        <w:t xml:space="preserve"> TS </w:t>
       </w:r>
       <w:r>
         <w:rPr>
@@ -399,7 +763,27 @@
                 <w:sz w:val="32"/>
                 <w:szCs w:val="32"/>
               </w:rPr>
-              <w:t>)-  e£</w:t>
+              <w:t>)</w:t>
+            </w:r>
+            <w:proofErr w:type="gramStart"/>
+            <w:r>
+              <w:rPr>
+                <w:rFonts w:ascii="BRH Malayalam Extra" w:hAnsi="BRH Malayalam Extra" w:cs="BRH Malayalam Extra"/>
+                <w:color w:val="000000"/>
+                <w:sz w:val="32"/>
+                <w:szCs w:val="32"/>
+              </w:rPr>
+              <w:t>-  e</w:t>
+            </w:r>
+            <w:proofErr w:type="gramEnd"/>
+            <w:r>
+              <w:rPr>
+                <w:rFonts w:ascii="BRH Malayalam Extra" w:hAnsi="BRH Malayalam Extra" w:cs="BRH Malayalam Extra"/>
+                <w:color w:val="000000"/>
+                <w:sz w:val="32"/>
+                <w:szCs w:val="32"/>
+              </w:rPr>
+              <w:t>£</w:t>
             </w:r>
             <w:r>
               <w:rPr>
@@ -750,7 +1134,27 @@
                 <w:sz w:val="32"/>
                 <w:szCs w:val="32"/>
               </w:rPr>
-              <w:t>)-  Ad¡— | py | öK</w:t>
+              <w:t>)</w:t>
+            </w:r>
+            <w:proofErr w:type="gramStart"/>
+            <w:r>
+              <w:rPr>
+                <w:rFonts w:ascii="BRH Malayalam Extra" w:hAnsi="BRH Malayalam Extra" w:cs="BRH Malayalam Extra"/>
+                <w:color w:val="000000"/>
+                <w:sz w:val="32"/>
+                <w:szCs w:val="32"/>
+              </w:rPr>
+              <w:t>-  Ad</w:t>
+            </w:r>
+            <w:proofErr w:type="gramEnd"/>
+            <w:r>
+              <w:rPr>
+                <w:rFonts w:ascii="BRH Malayalam Extra" w:hAnsi="BRH Malayalam Extra" w:cs="BRH Malayalam Extra"/>
+                <w:color w:val="000000"/>
+                <w:sz w:val="32"/>
+                <w:szCs w:val="32"/>
+              </w:rPr>
+              <w:t>¡— | py | öK</w:t>
             </w:r>
             <w:r>
               <w:rPr>
@@ -1058,7 +1462,27 @@
                 <w:sz w:val="32"/>
                 <w:szCs w:val="32"/>
               </w:rPr>
-              <w:t>)-  e£</w:t>
+              <w:t>)</w:t>
+            </w:r>
+            <w:proofErr w:type="gramStart"/>
+            <w:r>
+              <w:rPr>
+                <w:rFonts w:ascii="BRH Malayalam Extra" w:hAnsi="BRH Malayalam Extra" w:cs="BRH Malayalam Extra"/>
+                <w:color w:val="000000"/>
+                <w:sz w:val="32"/>
+                <w:szCs w:val="32"/>
+              </w:rPr>
+              <w:t>-  e</w:t>
+            </w:r>
+            <w:proofErr w:type="gramEnd"/>
+            <w:r>
+              <w:rPr>
+                <w:rFonts w:ascii="BRH Malayalam Extra" w:hAnsi="BRH Malayalam Extra" w:cs="BRH Malayalam Extra"/>
+                <w:color w:val="000000"/>
+                <w:sz w:val="32"/>
+                <w:szCs w:val="32"/>
+              </w:rPr>
+              <w:t>£</w:t>
             </w:r>
             <w:r>
               <w:rPr>
@@ -1428,7 +1852,27 @@
                 <w:sz w:val="32"/>
                 <w:szCs w:val="32"/>
               </w:rPr>
-              <w:t>)-  Ad¡— | py | öK</w:t>
+              <w:t>)</w:t>
+            </w:r>
+            <w:proofErr w:type="gramStart"/>
+            <w:r>
+              <w:rPr>
+                <w:rFonts w:ascii="BRH Malayalam Extra" w:hAnsi="BRH Malayalam Extra" w:cs="BRH Malayalam Extra"/>
+                <w:color w:val="000000"/>
+                <w:sz w:val="32"/>
+                <w:szCs w:val="32"/>
+              </w:rPr>
+              <w:t>-  Ad</w:t>
+            </w:r>
+            <w:proofErr w:type="gramEnd"/>
+            <w:r>
+              <w:rPr>
+                <w:rFonts w:ascii="BRH Malayalam Extra" w:hAnsi="BRH Malayalam Extra" w:cs="BRH Malayalam Extra"/>
+                <w:color w:val="000000"/>
+                <w:sz w:val="32"/>
+                <w:szCs w:val="32"/>
+              </w:rPr>
+              <w:t>¡— | py | öK</w:t>
             </w:r>
             <w:r>
               <w:rPr>
@@ -1768,8 +2212,19 @@
                 <w:sz w:val="32"/>
                 <w:szCs w:val="32"/>
               </w:rPr>
-              <w:t>)-  A</w:t>
-            </w:r>
+              <w:t>)</w:t>
+            </w:r>
+            <w:proofErr w:type="gramStart"/>
+            <w:r>
+              <w:rPr>
+                <w:rFonts w:ascii="BRH Malayalam Extra" w:hAnsi="BRH Malayalam Extra" w:cs="BRH Malayalam Extra"/>
+                <w:color w:val="000000"/>
+                <w:sz w:val="32"/>
+                <w:szCs w:val="32"/>
+              </w:rPr>
+              <w:t>-  A</w:t>
+            </w:r>
+            <w:proofErr w:type="gramEnd"/>
             <w:r>
               <w:rPr>
                 <w:rFonts w:ascii="BRH Malayalam Extra" w:hAnsi="BRH Malayalam Extra" w:cs="BRH Malayalam Extra"/>
@@ -2137,7 +2592,27 @@
                 <w:sz w:val="32"/>
                 <w:szCs w:val="32"/>
               </w:rPr>
-              <w:t>)-  Ad¡— | py | öK</w:t>
+              <w:t>)</w:t>
+            </w:r>
+            <w:proofErr w:type="gramStart"/>
+            <w:r>
+              <w:rPr>
+                <w:rFonts w:ascii="BRH Malayalam Extra" w:hAnsi="BRH Malayalam Extra" w:cs="BRH Malayalam Extra"/>
+                <w:color w:val="000000"/>
+                <w:sz w:val="32"/>
+                <w:szCs w:val="32"/>
+              </w:rPr>
+              <w:t>-  Ad</w:t>
+            </w:r>
+            <w:proofErr w:type="gramEnd"/>
+            <w:r>
+              <w:rPr>
+                <w:rFonts w:ascii="BRH Malayalam Extra" w:hAnsi="BRH Malayalam Extra" w:cs="BRH Malayalam Extra"/>
+                <w:color w:val="000000"/>
+                <w:sz w:val="32"/>
+                <w:szCs w:val="32"/>
+              </w:rPr>
+              <w:t>¡— | py | öK</w:t>
             </w:r>
             <w:r>
               <w:rPr>
@@ -2214,6 +2689,7 @@
                 <w:sz w:val="32"/>
                 <w:szCs w:val="32"/>
               </w:rPr>
+              <w:lastRenderedPageBreak/>
               <w:t>A</w:t>
             </w:r>
             <w:r>
@@ -2324,6 +2800,7 @@
                 <w:sz w:val="32"/>
                 <w:szCs w:val="32"/>
               </w:rPr>
+              <w:lastRenderedPageBreak/>
               <w:t>(</w:t>
             </w:r>
             <w:proofErr w:type="gramStart"/>
@@ -2445,8 +2922,19 @@
                 <w:sz w:val="32"/>
                 <w:szCs w:val="32"/>
               </w:rPr>
-              <w:t>)-  A</w:t>
-            </w:r>
+              <w:t>)</w:t>
+            </w:r>
+            <w:proofErr w:type="gramStart"/>
+            <w:r>
+              <w:rPr>
+                <w:rFonts w:ascii="BRH Malayalam Extra" w:hAnsi="BRH Malayalam Extra" w:cs="BRH Malayalam Extra"/>
+                <w:color w:val="000000"/>
+                <w:sz w:val="32"/>
+                <w:szCs w:val="32"/>
+              </w:rPr>
+              <w:t>-  A</w:t>
+            </w:r>
+            <w:proofErr w:type="gramEnd"/>
             <w:r>
               <w:rPr>
                 <w:rFonts w:ascii="BRH Malayalam Extra" w:hAnsi="BRH Malayalam Extra" w:cs="BRH Malayalam Extra"/>
@@ -2833,7 +3321,27 @@
                 <w:sz w:val="32"/>
                 <w:szCs w:val="32"/>
               </w:rPr>
-              <w:t>)-  Ad¡— | py | öK</w:t>
+              <w:t>)</w:t>
+            </w:r>
+            <w:proofErr w:type="gramStart"/>
+            <w:r>
+              <w:rPr>
+                <w:rFonts w:ascii="BRH Malayalam Extra" w:hAnsi="BRH Malayalam Extra" w:cs="BRH Malayalam Extra"/>
+                <w:color w:val="000000"/>
+                <w:sz w:val="32"/>
+                <w:szCs w:val="32"/>
+              </w:rPr>
+              <w:t>-  Ad</w:t>
+            </w:r>
+            <w:proofErr w:type="gramEnd"/>
+            <w:r>
+              <w:rPr>
+                <w:rFonts w:ascii="BRH Malayalam Extra" w:hAnsi="BRH Malayalam Extra" w:cs="BRH Malayalam Extra"/>
+                <w:color w:val="000000"/>
+                <w:sz w:val="32"/>
+                <w:szCs w:val="32"/>
+              </w:rPr>
+              <w:t>¡— | py | öK</w:t>
             </w:r>
             <w:r>
               <w:rPr>
@@ -2910,6 +3418,7 @@
                 <w:sz w:val="32"/>
                 <w:szCs w:val="32"/>
               </w:rPr>
+              <w:lastRenderedPageBreak/>
               <w:t>A</w:t>
             </w:r>
             <w:r>
@@ -3053,6 +3562,7 @@
                 <w:sz w:val="32"/>
                 <w:szCs w:val="32"/>
               </w:rPr>
+              <w:lastRenderedPageBreak/>
               <w:t>(</w:t>
             </w:r>
             <w:proofErr w:type="gramStart"/>
@@ -3174,7 +3684,27 @@
                 <w:sz w:val="32"/>
                 <w:szCs w:val="32"/>
               </w:rPr>
-              <w:t>)-  byp˜I | Ad¡— | py |</w:t>
+              <w:t>)</w:t>
+            </w:r>
+            <w:proofErr w:type="gramStart"/>
+            <w:r>
+              <w:rPr>
+                <w:rFonts w:ascii="BRH Malayalam Extra" w:hAnsi="BRH Malayalam Extra" w:cs="BRH Malayalam Extra"/>
+                <w:color w:val="000000"/>
+                <w:sz w:val="32"/>
+                <w:szCs w:val="32"/>
+              </w:rPr>
+              <w:t>-  byp</w:t>
+            </w:r>
+            <w:proofErr w:type="gramEnd"/>
+            <w:r>
+              <w:rPr>
+                <w:rFonts w:ascii="BRH Malayalam Extra" w:hAnsi="BRH Malayalam Extra" w:cs="BRH Malayalam Extra"/>
+                <w:color w:val="000000"/>
+                <w:sz w:val="32"/>
+                <w:szCs w:val="32"/>
+              </w:rPr>
+              <w:t>˜I | Ad¡— | py |</w:t>
             </w:r>
           </w:p>
           <w:p>
@@ -3386,7 +3916,6 @@
                 <w:sz w:val="32"/>
                 <w:szCs w:val="32"/>
               </w:rPr>
-              <w:lastRenderedPageBreak/>
               <w:t>(</w:t>
             </w:r>
             <w:proofErr w:type="gramStart"/>
@@ -3508,7 +4037,27 @@
                 <w:sz w:val="32"/>
                 <w:szCs w:val="32"/>
               </w:rPr>
-              <w:t>)-  Ad¡— | py | öK</w:t>
+              <w:t>)</w:t>
+            </w:r>
+            <w:proofErr w:type="gramStart"/>
+            <w:r>
+              <w:rPr>
+                <w:rFonts w:ascii="BRH Malayalam Extra" w:hAnsi="BRH Malayalam Extra" w:cs="BRH Malayalam Extra"/>
+                <w:color w:val="000000"/>
+                <w:sz w:val="32"/>
+                <w:szCs w:val="32"/>
+              </w:rPr>
+              <w:t>-  Ad</w:t>
+            </w:r>
+            <w:proofErr w:type="gramEnd"/>
+            <w:r>
+              <w:rPr>
+                <w:rFonts w:ascii="BRH Malayalam Extra" w:hAnsi="BRH Malayalam Extra" w:cs="BRH Malayalam Extra"/>
+                <w:color w:val="000000"/>
+                <w:sz w:val="32"/>
+                <w:szCs w:val="32"/>
+              </w:rPr>
+              <w:t>¡— | py | öK</w:t>
             </w:r>
             <w:r>
               <w:rPr>
@@ -3695,7 +4244,6 @@
                 <w:sz w:val="32"/>
                 <w:szCs w:val="32"/>
               </w:rPr>
-              <w:lastRenderedPageBreak/>
               <w:t>(</w:t>
             </w:r>
             <w:proofErr w:type="gramStart"/>
@@ -3817,7 +4365,27 @@
                 <w:sz w:val="32"/>
                 <w:szCs w:val="32"/>
               </w:rPr>
-              <w:t>)-  byp˜I | Ad¡— | py |</w:t>
+              <w:t>)</w:t>
+            </w:r>
+            <w:proofErr w:type="gramStart"/>
+            <w:r>
+              <w:rPr>
+                <w:rFonts w:ascii="BRH Malayalam Extra" w:hAnsi="BRH Malayalam Extra" w:cs="BRH Malayalam Extra"/>
+                <w:color w:val="000000"/>
+                <w:sz w:val="32"/>
+                <w:szCs w:val="32"/>
+              </w:rPr>
+              <w:t>-  byp</w:t>
+            </w:r>
+            <w:proofErr w:type="gramEnd"/>
+            <w:r>
+              <w:rPr>
+                <w:rFonts w:ascii="BRH Malayalam Extra" w:hAnsi="BRH Malayalam Extra" w:cs="BRH Malayalam Extra"/>
+                <w:color w:val="000000"/>
+                <w:sz w:val="32"/>
+                <w:szCs w:val="32"/>
+              </w:rPr>
+              <w:t>˜I | Ad¡— | py |</w:t>
             </w:r>
           </w:p>
           <w:p>
@@ -4047,7 +4615,6 @@
                 <w:sz w:val="32"/>
                 <w:szCs w:val="32"/>
               </w:rPr>
-              <w:lastRenderedPageBreak/>
               <w:t>(</w:t>
             </w:r>
             <w:proofErr w:type="gramStart"/>
@@ -4169,7 +4736,27 @@
                 <w:sz w:val="32"/>
                 <w:szCs w:val="32"/>
               </w:rPr>
-              <w:t>)-  Ad¡— | py | öK</w:t>
+              <w:t>)</w:t>
+            </w:r>
+            <w:proofErr w:type="gramStart"/>
+            <w:r>
+              <w:rPr>
+                <w:rFonts w:ascii="BRH Malayalam Extra" w:hAnsi="BRH Malayalam Extra" w:cs="BRH Malayalam Extra"/>
+                <w:color w:val="000000"/>
+                <w:sz w:val="32"/>
+                <w:szCs w:val="32"/>
+              </w:rPr>
+              <w:t>-  Ad</w:t>
+            </w:r>
+            <w:proofErr w:type="gramEnd"/>
+            <w:r>
+              <w:rPr>
+                <w:rFonts w:ascii="BRH Malayalam Extra" w:hAnsi="BRH Malayalam Extra" w:cs="BRH Malayalam Extra"/>
+                <w:color w:val="000000"/>
+                <w:sz w:val="32"/>
+                <w:szCs w:val="32"/>
+              </w:rPr>
+              <w:t>¡— | py | öK</w:t>
             </w:r>
             <w:r>
               <w:rPr>
@@ -4390,7 +4977,6 @@
                 <w:sz w:val="32"/>
                 <w:szCs w:val="32"/>
               </w:rPr>
-              <w:lastRenderedPageBreak/>
               <w:t>(</w:t>
             </w:r>
             <w:proofErr w:type="gramStart"/>
@@ -4512,7 +5098,27 @@
                 <w:sz w:val="32"/>
                 <w:szCs w:val="32"/>
               </w:rPr>
-              <w:t>)-  byq—J | Ad¡— | py |</w:t>
+              <w:t>)</w:t>
+            </w:r>
+            <w:proofErr w:type="gramStart"/>
+            <w:r>
+              <w:rPr>
+                <w:rFonts w:ascii="BRH Malayalam Extra" w:hAnsi="BRH Malayalam Extra" w:cs="BRH Malayalam Extra"/>
+                <w:color w:val="000000"/>
+                <w:sz w:val="32"/>
+                <w:szCs w:val="32"/>
+              </w:rPr>
+              <w:t>-  byq</w:t>
+            </w:r>
+            <w:proofErr w:type="gramEnd"/>
+            <w:r>
+              <w:rPr>
+                <w:rFonts w:ascii="BRH Malayalam Extra" w:hAnsi="BRH Malayalam Extra" w:cs="BRH Malayalam Extra"/>
+                <w:color w:val="000000"/>
+                <w:sz w:val="32"/>
+                <w:szCs w:val="32"/>
+              </w:rPr>
+              <w:t>—J | Ad¡— | py |</w:t>
             </w:r>
           </w:p>
           <w:p>
@@ -4791,7 +5397,27 @@
                 <w:sz w:val="32"/>
                 <w:szCs w:val="32"/>
               </w:rPr>
-              <w:t>)-  Ad¡— | py | öK</w:t>
+              <w:t>)</w:t>
+            </w:r>
+            <w:proofErr w:type="gramStart"/>
+            <w:r>
+              <w:rPr>
+                <w:rFonts w:ascii="BRH Malayalam Extra" w:hAnsi="BRH Malayalam Extra" w:cs="BRH Malayalam Extra"/>
+                <w:color w:val="000000"/>
+                <w:sz w:val="32"/>
+                <w:szCs w:val="32"/>
+              </w:rPr>
+              <w:t>-  Ad</w:t>
+            </w:r>
+            <w:proofErr w:type="gramEnd"/>
+            <w:r>
+              <w:rPr>
+                <w:rFonts w:ascii="BRH Malayalam Extra" w:hAnsi="BRH Malayalam Extra" w:cs="BRH Malayalam Extra"/>
+                <w:color w:val="000000"/>
+                <w:sz w:val="32"/>
+                <w:szCs w:val="32"/>
+              </w:rPr>
+              <w:t>¡— | py | öK</w:t>
             </w:r>
             <w:r>
               <w:rPr>
@@ -5099,7 +5725,27 @@
                 <w:sz w:val="32"/>
                 <w:szCs w:val="32"/>
               </w:rPr>
-              <w:t>)-  byq—J | Ad¡— | py |</w:t>
+              <w:t>)</w:t>
+            </w:r>
+            <w:proofErr w:type="gramStart"/>
+            <w:r>
+              <w:rPr>
+                <w:rFonts w:ascii="BRH Malayalam Extra" w:hAnsi="BRH Malayalam Extra" w:cs="BRH Malayalam Extra"/>
+                <w:color w:val="000000"/>
+                <w:sz w:val="32"/>
+                <w:szCs w:val="32"/>
+              </w:rPr>
+              <w:t>-  byq</w:t>
+            </w:r>
+            <w:proofErr w:type="gramEnd"/>
+            <w:r>
+              <w:rPr>
+                <w:rFonts w:ascii="BRH Malayalam Extra" w:hAnsi="BRH Malayalam Extra" w:cs="BRH Malayalam Extra"/>
+                <w:color w:val="000000"/>
+                <w:sz w:val="32"/>
+                <w:szCs w:val="32"/>
+              </w:rPr>
+              <w:t>—J | Ad¡— | py |</w:t>
             </w:r>
           </w:p>
           <w:p>
@@ -5396,7 +6042,27 @@
                 <w:sz w:val="32"/>
                 <w:szCs w:val="32"/>
               </w:rPr>
-              <w:t>)-  Ad¡— | py | öK</w:t>
+              <w:t>)</w:t>
+            </w:r>
+            <w:proofErr w:type="gramStart"/>
+            <w:r>
+              <w:rPr>
+                <w:rFonts w:ascii="BRH Malayalam Extra" w:hAnsi="BRH Malayalam Extra" w:cs="BRH Malayalam Extra"/>
+                <w:color w:val="000000"/>
+                <w:sz w:val="32"/>
+                <w:szCs w:val="32"/>
+              </w:rPr>
+              <w:t>-  Ad</w:t>
+            </w:r>
+            <w:proofErr w:type="gramEnd"/>
+            <w:r>
+              <w:rPr>
+                <w:rFonts w:ascii="BRH Malayalam Extra" w:hAnsi="BRH Malayalam Extra" w:cs="BRH Malayalam Extra"/>
+                <w:color w:val="000000"/>
+                <w:sz w:val="32"/>
+                <w:szCs w:val="32"/>
+              </w:rPr>
+              <w:t>¡— | py | öK</w:t>
             </w:r>
             <w:r>
               <w:rPr>
@@ -5617,6 +6283,7 @@
                 <w:sz w:val="32"/>
                 <w:szCs w:val="32"/>
               </w:rPr>
+              <w:lastRenderedPageBreak/>
               <w:t>(</w:t>
             </w:r>
             <w:proofErr w:type="gramStart"/>
@@ -5738,8 +6405,19 @@
                 <w:sz w:val="32"/>
                 <w:szCs w:val="32"/>
               </w:rPr>
-              <w:t>)-  Zûx</w:t>
-            </w:r>
+              <w:t>)</w:t>
+            </w:r>
+            <w:proofErr w:type="gramStart"/>
+            <w:r>
+              <w:rPr>
+                <w:rFonts w:ascii="BRH Malayalam Extra" w:hAnsi="BRH Malayalam Extra" w:cs="BRH Malayalam Extra"/>
+                <w:color w:val="000000"/>
+                <w:sz w:val="32"/>
+                <w:szCs w:val="32"/>
+              </w:rPr>
+              <w:t>-  Zûx</w:t>
+            </w:r>
+            <w:proofErr w:type="gramEnd"/>
             <w:r>
               <w:rPr>
                 <w:rFonts w:ascii="BRH Malayalam Extra" w:hAnsi="BRH Malayalam Extra" w:cs="BRH Malayalam Extra"/>
@@ -6107,7 +6785,27 @@
                 <w:sz w:val="32"/>
                 <w:szCs w:val="32"/>
               </w:rPr>
-              <w:t>)-  sªpx˜J | px</w:t>
+              <w:t>)</w:t>
+            </w:r>
+            <w:proofErr w:type="gramStart"/>
+            <w:r>
+              <w:rPr>
+                <w:rFonts w:ascii="BRH Malayalam Extra" w:hAnsi="BRH Malayalam Extra" w:cs="BRH Malayalam Extra"/>
+                <w:color w:val="000000"/>
+                <w:sz w:val="32"/>
+                <w:szCs w:val="32"/>
+              </w:rPr>
+              <w:t>-  sªpx</w:t>
+            </w:r>
+            <w:proofErr w:type="gramEnd"/>
+            <w:r>
+              <w:rPr>
+                <w:rFonts w:ascii="BRH Malayalam Extra" w:hAnsi="BRH Malayalam Extra" w:cs="BRH Malayalam Extra"/>
+                <w:color w:val="000000"/>
+                <w:sz w:val="32"/>
+                <w:szCs w:val="32"/>
+              </w:rPr>
+              <w:t>˜J | px</w:t>
             </w:r>
             <w:r>
               <w:rPr>
@@ -6415,7 +7113,6 @@
                 <w:sz w:val="32"/>
                 <w:szCs w:val="32"/>
               </w:rPr>
-              <w:lastRenderedPageBreak/>
               <w:t>(</w:t>
             </w:r>
             <w:proofErr w:type="gramStart"/>
@@ -6537,8 +7234,19 @@
                 <w:sz w:val="32"/>
                 <w:szCs w:val="32"/>
               </w:rPr>
-              <w:t>)-  px</w:t>
-            </w:r>
+              <w:t>)</w:t>
+            </w:r>
+            <w:proofErr w:type="gramStart"/>
+            <w:r>
+              <w:rPr>
+                <w:rFonts w:ascii="BRH Malayalam Extra" w:hAnsi="BRH Malayalam Extra" w:cs="BRH Malayalam Extra"/>
+                <w:color w:val="000000"/>
+                <w:sz w:val="32"/>
+                <w:szCs w:val="32"/>
+              </w:rPr>
+              <w:t>-  px</w:t>
+            </w:r>
+            <w:proofErr w:type="gramEnd"/>
             <w:r>
               <w:rPr>
                 <w:rFonts w:ascii="BRH Malayalam Extra" w:hAnsi="BRH Malayalam Extra" w:cs="BRH Malayalam Extra"/>
@@ -6989,7 +7697,6 @@
                 <w:sz w:val="32"/>
                 <w:szCs w:val="32"/>
               </w:rPr>
-              <w:lastRenderedPageBreak/>
               <w:t>(</w:t>
             </w:r>
             <w:proofErr w:type="gramStart"/>
@@ -7111,8 +7818,19 @@
                 <w:sz w:val="32"/>
                 <w:szCs w:val="32"/>
               </w:rPr>
-              <w:t>)-  Zûx</w:t>
-            </w:r>
+              <w:t>)</w:t>
+            </w:r>
+            <w:proofErr w:type="gramStart"/>
+            <w:r>
+              <w:rPr>
+                <w:rFonts w:ascii="BRH Malayalam Extra" w:hAnsi="BRH Malayalam Extra" w:cs="BRH Malayalam Extra"/>
+                <w:color w:val="000000"/>
+                <w:sz w:val="32"/>
+                <w:szCs w:val="32"/>
+              </w:rPr>
+              <w:t>-  Zûx</w:t>
+            </w:r>
+            <w:proofErr w:type="gramEnd"/>
             <w:r>
               <w:rPr>
                 <w:rFonts w:ascii="BRH Malayalam Extra" w:hAnsi="BRH Malayalam Extra" w:cs="BRH Malayalam Extra"/>
@@ -7480,7 +8198,27 @@
                 <w:sz w:val="32"/>
                 <w:szCs w:val="32"/>
               </w:rPr>
-              <w:t>)-  sªpx˜J | px</w:t>
+              <w:t>)</w:t>
+            </w:r>
+            <w:proofErr w:type="gramStart"/>
+            <w:r>
+              <w:rPr>
+                <w:rFonts w:ascii="BRH Malayalam Extra" w:hAnsi="BRH Malayalam Extra" w:cs="BRH Malayalam Extra"/>
+                <w:color w:val="000000"/>
+                <w:sz w:val="32"/>
+                <w:szCs w:val="32"/>
+              </w:rPr>
+              <w:t>-  sªpx</w:t>
+            </w:r>
+            <w:proofErr w:type="gramEnd"/>
+            <w:r>
+              <w:rPr>
+                <w:rFonts w:ascii="BRH Malayalam Extra" w:hAnsi="BRH Malayalam Extra" w:cs="BRH Malayalam Extra"/>
+                <w:color w:val="000000"/>
+                <w:sz w:val="32"/>
+                <w:szCs w:val="32"/>
+              </w:rPr>
+              <w:t>˜J | px</w:t>
             </w:r>
             <w:r>
               <w:rPr>
@@ -7783,7 +8521,6 @@
                 <w:sz w:val="32"/>
                 <w:szCs w:val="32"/>
               </w:rPr>
-              <w:lastRenderedPageBreak/>
               <w:t>(</w:t>
             </w:r>
             <w:proofErr w:type="gramStart"/>
@@ -7905,8 +8642,19 @@
                 <w:sz w:val="32"/>
                 <w:szCs w:val="32"/>
               </w:rPr>
-              <w:t>)-  px</w:t>
-            </w:r>
+              <w:t>)</w:t>
+            </w:r>
+            <w:proofErr w:type="gramStart"/>
+            <w:r>
+              <w:rPr>
+                <w:rFonts w:ascii="BRH Malayalam Extra" w:hAnsi="BRH Malayalam Extra" w:cs="BRH Malayalam Extra"/>
+                <w:color w:val="000000"/>
+                <w:sz w:val="32"/>
+                <w:szCs w:val="32"/>
+              </w:rPr>
+              <w:t>-  px</w:t>
+            </w:r>
+            <w:proofErr w:type="gramEnd"/>
             <w:r>
               <w:rPr>
                 <w:rFonts w:ascii="BRH Malayalam Extra" w:hAnsi="BRH Malayalam Extra" w:cs="BRH Malayalam Extra"/>
@@ -8381,7 +9129,6 @@
                 <w:sz w:val="32"/>
                 <w:szCs w:val="32"/>
               </w:rPr>
-              <w:lastRenderedPageBreak/>
               <w:t>(</w:t>
             </w:r>
             <w:proofErr w:type="gramStart"/>
@@ -8503,7 +9250,27 @@
                 <w:sz w:val="32"/>
                 <w:szCs w:val="32"/>
               </w:rPr>
-              <w:t>)-  A¥</w:t>
+              <w:t>)</w:t>
+            </w:r>
+            <w:proofErr w:type="gramStart"/>
+            <w:r>
+              <w:rPr>
+                <w:rFonts w:ascii="BRH Malayalam Extra" w:hAnsi="BRH Malayalam Extra" w:cs="BRH Malayalam Extra"/>
+                <w:color w:val="000000"/>
+                <w:sz w:val="32"/>
+                <w:szCs w:val="32"/>
+              </w:rPr>
+              <w:t>-  A</w:t>
+            </w:r>
+            <w:proofErr w:type="gramEnd"/>
+            <w:r>
+              <w:rPr>
+                <w:rFonts w:ascii="BRH Malayalam Extra" w:hAnsi="BRH Malayalam Extra" w:cs="BRH Malayalam Extra"/>
+                <w:color w:val="000000"/>
+                <w:sz w:val="32"/>
+                <w:szCs w:val="32"/>
+              </w:rPr>
+              <w:t>¥</w:t>
             </w:r>
             <w:r>
               <w:rPr>
@@ -9018,7 +9785,27 @@
                 <w:sz w:val="32"/>
                 <w:szCs w:val="32"/>
               </w:rPr>
-              <w:t>)-  A¥</w:t>
+              <w:t>)</w:t>
+            </w:r>
+            <w:proofErr w:type="gramStart"/>
+            <w:r>
+              <w:rPr>
+                <w:rFonts w:ascii="BRH Malayalam Extra" w:hAnsi="BRH Malayalam Extra" w:cs="BRH Malayalam Extra"/>
+                <w:color w:val="000000"/>
+                <w:sz w:val="32"/>
+                <w:szCs w:val="32"/>
+              </w:rPr>
+              <w:t>-  A</w:t>
+            </w:r>
+            <w:proofErr w:type="gramEnd"/>
+            <w:r>
+              <w:rPr>
+                <w:rFonts w:ascii="BRH Malayalam Extra" w:hAnsi="BRH Malayalam Extra" w:cs="BRH Malayalam Extra"/>
+                <w:color w:val="000000"/>
+                <w:sz w:val="32"/>
+                <w:szCs w:val="32"/>
+              </w:rPr>
+              <w:t>¥</w:t>
             </w:r>
             <w:r>
               <w:rPr>
@@ -9415,6 +10202,7 @@
                 <w:sz w:val="32"/>
                 <w:szCs w:val="32"/>
               </w:rPr>
+              <w:lastRenderedPageBreak/>
               <w:t>(</w:t>
             </w:r>
             <w:proofErr w:type="gramStart"/>
@@ -9522,8 +10310,18 @@
                 <w:sz w:val="32"/>
                 <w:szCs w:val="32"/>
               </w:rPr>
-              <w:t>)-  A</w:t>
-            </w:r>
+              <w:t>)</w:t>
+            </w:r>
+            <w:proofErr w:type="gramStart"/>
+            <w:r>
+              <w:rPr>
+                <w:rFonts w:ascii="BRH Malayalam Extra" w:hAnsi="BRH Malayalam Extra" w:cs="BRH Malayalam Extra"/>
+                <w:sz w:val="32"/>
+                <w:szCs w:val="32"/>
+              </w:rPr>
+              <w:t>-  A</w:t>
+            </w:r>
+            <w:proofErr w:type="gramEnd"/>
             <w:r>
               <w:rPr>
                 <w:rFonts w:ascii="BRH Malayalam Extra" w:hAnsi="BRH Malayalam Extra" w:cs="BRH Malayalam Extra"/>
@@ -9819,8 +10617,18 @@
                 <w:sz w:val="32"/>
                 <w:szCs w:val="32"/>
               </w:rPr>
-              <w:t>)-  A</w:t>
-            </w:r>
+              <w:t>)</w:t>
+            </w:r>
+            <w:proofErr w:type="gramStart"/>
+            <w:r>
+              <w:rPr>
+                <w:rFonts w:ascii="BRH Malayalam Extra" w:hAnsi="BRH Malayalam Extra" w:cs="BRH Malayalam Extra"/>
+                <w:sz w:val="32"/>
+                <w:szCs w:val="32"/>
+              </w:rPr>
+              <w:t>-  A</w:t>
+            </w:r>
+            <w:proofErr w:type="gramEnd"/>
             <w:r>
               <w:rPr>
                 <w:rFonts w:ascii="BRH Malayalam Extra" w:hAnsi="BRH Malayalam Extra" w:cs="BRH Malayalam Extra"/>
@@ -10153,8 +10961,19 @@
                 <w:sz w:val="32"/>
                 <w:szCs w:val="32"/>
               </w:rPr>
-              <w:t>)-  B</w:t>
-            </w:r>
+              <w:t>)</w:t>
+            </w:r>
+            <w:proofErr w:type="gramStart"/>
+            <w:r>
+              <w:rPr>
+                <w:rFonts w:ascii="BRH Malayalam Extra" w:hAnsi="BRH Malayalam Extra" w:cs="BRH Malayalam Extra"/>
+                <w:color w:val="000000"/>
+                <w:sz w:val="32"/>
+                <w:szCs w:val="32"/>
+              </w:rPr>
+              <w:t>-  B</w:t>
+            </w:r>
+            <w:proofErr w:type="gramEnd"/>
             <w:r>
               <w:rPr>
                 <w:rFonts w:ascii="BRH Malayalam Extra" w:hAnsi="BRH Malayalam Extra" w:cs="BRH Malayalam Extra"/>
@@ -10484,8 +11303,19 @@
                 <w:sz w:val="32"/>
                 <w:szCs w:val="32"/>
               </w:rPr>
-              <w:t>)-  p</w:t>
-            </w:r>
+              <w:t>)</w:t>
+            </w:r>
+            <w:proofErr w:type="gramStart"/>
+            <w:r>
+              <w:rPr>
+                <w:rFonts w:ascii="BRH Malayalam Extra" w:hAnsi="BRH Malayalam Extra" w:cs="BRH Malayalam Extra"/>
+                <w:color w:val="000000"/>
+                <w:sz w:val="32"/>
+                <w:szCs w:val="32"/>
+              </w:rPr>
+              <w:t>-  p</w:t>
+            </w:r>
+            <w:proofErr w:type="gramEnd"/>
             <w:r>
               <w:rPr>
                 <w:rFonts w:ascii="BRH Malayalam Extra" w:hAnsi="BRH Malayalam Extra" w:cs="BRH Malayalam Extra"/>
@@ -10715,17 +11545,7 @@
                 <w:sz w:val="32"/>
                 <w:szCs w:val="32"/>
               </w:rPr>
-              <w:t xml:space="preserve">J sIöey—¥jx </w:t>
-            </w:r>
-            <w:r>
-              <w:rPr>
-                <w:rFonts w:ascii="BRH Malayalam Extra" w:hAnsi="BRH Malayalam Extra" w:cs="BRH Malayalam Extra"/>
-                <w:color w:val="000000"/>
-                <w:sz w:val="32"/>
-                <w:szCs w:val="32"/>
-              </w:rPr>
-              <w:lastRenderedPageBreak/>
-              <w:t>A</w:t>
+              <w:t>J sIöey—¥jx A</w:t>
             </w:r>
             <w:r>
               <w:rPr>
@@ -10797,7 +11617,6 @@
                 <w:sz w:val="32"/>
                 <w:szCs w:val="32"/>
               </w:rPr>
-              <w:lastRenderedPageBreak/>
               <w:t>(</w:t>
             </w:r>
             <w:proofErr w:type="gramStart"/>
@@ -10919,8 +11738,19 @@
                 <w:sz w:val="32"/>
                 <w:szCs w:val="32"/>
               </w:rPr>
-              <w:t>)-  B</w:t>
-            </w:r>
+              <w:t>)</w:t>
+            </w:r>
+            <w:proofErr w:type="gramStart"/>
+            <w:r>
+              <w:rPr>
+                <w:rFonts w:ascii="BRH Malayalam Extra" w:hAnsi="BRH Malayalam Extra" w:cs="BRH Malayalam Extra"/>
+                <w:color w:val="000000"/>
+                <w:sz w:val="32"/>
+                <w:szCs w:val="32"/>
+              </w:rPr>
+              <w:t>-  B</w:t>
+            </w:r>
+            <w:proofErr w:type="gramEnd"/>
             <w:r>
               <w:rPr>
                 <w:rFonts w:ascii="BRH Malayalam Extra" w:hAnsi="BRH Malayalam Extra" w:cs="BRH Malayalam Extra"/>
@@ -11268,8 +12098,19 @@
                 <w:sz w:val="32"/>
                 <w:szCs w:val="32"/>
               </w:rPr>
-              <w:t>)-  p</w:t>
-            </w:r>
+              <w:t>)</w:t>
+            </w:r>
+            <w:proofErr w:type="gramStart"/>
+            <w:r>
+              <w:rPr>
+                <w:rFonts w:ascii="BRH Malayalam Extra" w:hAnsi="BRH Malayalam Extra" w:cs="BRH Malayalam Extra"/>
+                <w:color w:val="000000"/>
+                <w:sz w:val="32"/>
+                <w:szCs w:val="32"/>
+              </w:rPr>
+              <w:t>-  p</w:t>
+            </w:r>
+            <w:proofErr w:type="gramEnd"/>
             <w:r>
               <w:rPr>
                 <w:rFonts w:ascii="BRH Malayalam Extra" w:hAnsi="BRH Malayalam Extra" w:cs="BRH Malayalam Extra"/>
@@ -11551,7 +12392,6 @@
                 <w:sz w:val="32"/>
                 <w:szCs w:val="32"/>
               </w:rPr>
-              <w:lastRenderedPageBreak/>
               <w:t>sIöey—¥jx A</w:t>
             </w:r>
             <w:r>
@@ -11657,7 +12497,6 @@
                 <w:sz w:val="32"/>
                 <w:szCs w:val="32"/>
               </w:rPr>
-              <w:lastRenderedPageBreak/>
               <w:t>(</w:t>
             </w:r>
             <w:proofErr w:type="gramStart"/>
@@ -11779,8 +12618,19 @@
                 <w:sz w:val="32"/>
                 <w:szCs w:val="32"/>
               </w:rPr>
-              <w:t>)-  P</w:t>
-            </w:r>
+              <w:t>)</w:t>
+            </w:r>
+            <w:proofErr w:type="gramStart"/>
+            <w:r>
+              <w:rPr>
+                <w:rFonts w:ascii="BRH Malayalam Extra" w:hAnsi="BRH Malayalam Extra" w:cs="BRH Malayalam Extra"/>
+                <w:color w:val="000000"/>
+                <w:sz w:val="32"/>
+                <w:szCs w:val="32"/>
+              </w:rPr>
+              <w:t>-  P</w:t>
+            </w:r>
+            <w:proofErr w:type="gramEnd"/>
             <w:r>
               <w:rPr>
                 <w:rFonts w:ascii="BRH Malayalam Extra" w:hAnsi="BRH Malayalam Extra" w:cs="BRH Malayalam Extra"/>
@@ -12255,8 +13105,19 @@
                 <w:sz w:val="32"/>
                 <w:szCs w:val="32"/>
               </w:rPr>
-              <w:t>)-  A</w:t>
-            </w:r>
+              <w:t>)</w:t>
+            </w:r>
+            <w:proofErr w:type="gramStart"/>
+            <w:r>
+              <w:rPr>
+                <w:rFonts w:ascii="BRH Malayalam Extra" w:hAnsi="BRH Malayalam Extra" w:cs="BRH Malayalam Extra"/>
+                <w:color w:val="000000"/>
+                <w:sz w:val="32"/>
+                <w:szCs w:val="32"/>
+              </w:rPr>
+              <w:t>-  A</w:t>
+            </w:r>
+            <w:proofErr w:type="gramEnd"/>
             <w:r>
               <w:rPr>
                 <w:rFonts w:ascii="BRH Malayalam Extra" w:hAnsi="BRH Malayalam Extra" w:cs="BRH Malayalam Extra"/>
@@ -12605,7 +13466,17 @@
                 <w:sz w:val="32"/>
                 <w:szCs w:val="32"/>
               </w:rPr>
-              <w:t xml:space="preserve"> „psëx— b</w:t>
+              <w:t xml:space="preserve"> </w:t>
+            </w:r>
+            <w:r>
+              <w:rPr>
+                <w:rFonts w:ascii="BRH Malayalam Extra" w:hAnsi="BRH Malayalam Extra" w:cs="BRH Malayalam Extra"/>
+                <w:color w:val="000000"/>
+                <w:sz w:val="32"/>
+                <w:szCs w:val="32"/>
+              </w:rPr>
+              <w:lastRenderedPageBreak/>
+              <w:t>„psëx— b</w:t>
             </w:r>
             <w:r>
               <w:rPr>
@@ -12814,8 +13685,19 @@
                 <w:sz w:val="32"/>
                 <w:szCs w:val="32"/>
               </w:rPr>
-              <w:t>)-  D</w:t>
-            </w:r>
+              <w:t>)</w:t>
+            </w:r>
+            <w:proofErr w:type="gramStart"/>
+            <w:r>
+              <w:rPr>
+                <w:rFonts w:ascii="BRH Malayalam Extra" w:hAnsi="BRH Malayalam Extra" w:cs="BRH Malayalam Extra"/>
+                <w:color w:val="000000"/>
+                <w:sz w:val="32"/>
+                <w:szCs w:val="32"/>
+              </w:rPr>
+              <w:t>-  D</w:t>
+            </w:r>
+            <w:proofErr w:type="gramEnd"/>
             <w:r>
               <w:rPr>
                 <w:rFonts w:ascii="BRH Malayalam Extra" w:hAnsi="BRH Malayalam Extra" w:cs="BRH Malayalam Extra"/>
@@ -13204,8 +14086,19 @@
                 <w:sz w:val="32"/>
                 <w:szCs w:val="32"/>
               </w:rPr>
-              <w:t>)-  D</w:t>
-            </w:r>
+              <w:t>)</w:t>
+            </w:r>
+            <w:proofErr w:type="gramStart"/>
+            <w:r>
+              <w:rPr>
+                <w:rFonts w:ascii="BRH Malayalam Extra" w:hAnsi="BRH Malayalam Extra" w:cs="BRH Malayalam Extra"/>
+                <w:color w:val="000000"/>
+                <w:sz w:val="32"/>
+                <w:szCs w:val="32"/>
+              </w:rPr>
+              <w:t>-  D</w:t>
+            </w:r>
+            <w:proofErr w:type="gramEnd"/>
             <w:r>
               <w:rPr>
                 <w:rFonts w:ascii="BRH Malayalam Extra" w:hAnsi="BRH Malayalam Extra" w:cs="BRH Malayalam Extra"/>
@@ -13371,6 +14264,7 @@
                 <w:sz w:val="32"/>
                 <w:szCs w:val="32"/>
               </w:rPr>
+              <w:lastRenderedPageBreak/>
               <w:t>(</w:t>
             </w:r>
             <w:proofErr w:type="gramStart"/>
@@ -13492,8 +14386,19 @@
                 <w:sz w:val="32"/>
                 <w:szCs w:val="32"/>
               </w:rPr>
-              <w:t>)-  P</w:t>
-            </w:r>
+              <w:t>)</w:t>
+            </w:r>
+            <w:proofErr w:type="gramStart"/>
+            <w:r>
+              <w:rPr>
+                <w:rFonts w:ascii="BRH Malayalam Extra" w:hAnsi="BRH Malayalam Extra" w:cs="BRH Malayalam Extra"/>
+                <w:color w:val="000000"/>
+                <w:sz w:val="32"/>
+                <w:szCs w:val="32"/>
+              </w:rPr>
+              <w:t>-  P</w:t>
+            </w:r>
+            <w:proofErr w:type="gramEnd"/>
             <w:r>
               <w:rPr>
                 <w:rFonts w:ascii="BRH Malayalam Extra" w:hAnsi="BRH Malayalam Extra" w:cs="BRH Malayalam Extra"/>
@@ -14399,7 +15304,17 @@
                 <w:sz w:val="32"/>
                 <w:szCs w:val="32"/>
               </w:rPr>
-              <w:t>psëx— b¡e</w:t>
+              <w:t xml:space="preserve">psëx— </w:t>
+            </w:r>
+            <w:r>
+              <w:rPr>
+                <w:rFonts w:ascii="BRH Malayalam Extra" w:hAnsi="BRH Malayalam Extra" w:cs="BRH Malayalam Extra"/>
+                <w:color w:val="000000"/>
+                <w:sz w:val="32"/>
+                <w:szCs w:val="32"/>
+              </w:rPr>
+              <w:lastRenderedPageBreak/>
+              <w:t>b¡e</w:t>
             </w:r>
             <w:r>
               <w:rPr>
@@ -14590,8 +15505,19 @@
                 <w:sz w:val="32"/>
                 <w:szCs w:val="32"/>
               </w:rPr>
-              <w:t>)-  D</w:t>
-            </w:r>
+              <w:t>)</w:t>
+            </w:r>
+            <w:proofErr w:type="gramStart"/>
+            <w:r>
+              <w:rPr>
+                <w:rFonts w:ascii="BRH Malayalam Extra" w:hAnsi="BRH Malayalam Extra" w:cs="BRH Malayalam Extra"/>
+                <w:color w:val="000000"/>
+                <w:sz w:val="32"/>
+                <w:szCs w:val="32"/>
+              </w:rPr>
+              <w:t>-  D</w:t>
+            </w:r>
+            <w:proofErr w:type="gramEnd"/>
             <w:r>
               <w:rPr>
                 <w:rFonts w:ascii="BRH Malayalam Extra" w:hAnsi="BRH Malayalam Extra" w:cs="BRH Malayalam Extra"/>
@@ -15004,8 +15930,19 @@
                 <w:sz w:val="32"/>
                 <w:szCs w:val="32"/>
               </w:rPr>
-              <w:t>)-  D</w:t>
-            </w:r>
+              <w:t>)</w:t>
+            </w:r>
+            <w:proofErr w:type="gramStart"/>
+            <w:r>
+              <w:rPr>
+                <w:rFonts w:ascii="BRH Malayalam Extra" w:hAnsi="BRH Malayalam Extra" w:cs="BRH Malayalam Extra"/>
+                <w:color w:val="000000"/>
+                <w:sz w:val="32"/>
+                <w:szCs w:val="32"/>
+              </w:rPr>
+              <w:t>-  D</w:t>
+            </w:r>
+            <w:proofErr w:type="gramEnd"/>
             <w:r>
               <w:rPr>
                 <w:rFonts w:ascii="BRH Malayalam Extra" w:hAnsi="BRH Malayalam Extra" w:cs="BRH Malayalam Extra"/>
@@ -15074,7 +16011,6 @@
                 <w:color w:val="000000"/>
                 <w:sz w:val="32"/>
                 <w:szCs w:val="32"/>
-                <w:lang w:val="it-IT"/>
               </w:rPr>
             </w:pPr>
             <w:r>
@@ -15083,7 +16019,6 @@
                 <w:color w:val="000000"/>
                 <w:sz w:val="32"/>
                 <w:szCs w:val="32"/>
-                <w:lang w:val="it-IT"/>
               </w:rPr>
               <w:t>D</w:t>
             </w:r>
@@ -15093,17 +16028,15 @@
                 <w:color w:val="000000"/>
                 <w:sz w:val="28"/>
                 <w:szCs w:val="32"/>
-                <w:lang w:val="it-IT"/>
-              </w:rPr>
-              <w:t>–</w:t>
-            </w:r>
-            <w:r>
-              <w:rPr>
-                <w:rFonts w:ascii="BRH Malayalam Extra" w:hAnsi="BRH Malayalam Extra" w:cs="BRH Malayalam Extra"/>
-                <w:color w:val="000000"/>
-                <w:sz w:val="32"/>
-                <w:szCs w:val="32"/>
-                <w:lang w:val="it-IT"/>
+              </w:rPr>
+              <w:t>–</w:t>
+            </w:r>
+            <w:r>
+              <w:rPr>
+                <w:rFonts w:ascii="BRH Malayalam Extra" w:hAnsi="BRH Malayalam Extra" w:cs="BRH Malayalam Extra"/>
+                <w:color w:val="000000"/>
+                <w:sz w:val="32"/>
+                <w:szCs w:val="32"/>
               </w:rPr>
               <w:t>e</w:t>
             </w:r>
@@ -15113,17 +16046,15 @@
                 <w:color w:val="000000"/>
                 <w:sz w:val="28"/>
                 <w:szCs w:val="32"/>
-                <w:lang w:val="it-IT"/>
-              </w:rPr>
-              <w:t>–</w:t>
-            </w:r>
-            <w:r>
-              <w:rPr>
-                <w:rFonts w:ascii="BRH Malayalam Extra" w:hAnsi="BRH Malayalam Extra" w:cs="BRH Malayalam Extra"/>
-                <w:color w:val="000000"/>
-                <w:sz w:val="32"/>
-                <w:szCs w:val="32"/>
-                <w:lang w:val="it-IT"/>
+              </w:rPr>
+              <w:t>–</w:t>
+            </w:r>
+            <w:r>
+              <w:rPr>
+                <w:rFonts w:ascii="BRH Malayalam Extra" w:hAnsi="BRH Malayalam Extra" w:cs="BRH Malayalam Extra"/>
+                <w:color w:val="000000"/>
+                <w:sz w:val="32"/>
+                <w:szCs w:val="32"/>
               </w:rPr>
               <w:t>Zyrç—Ç</w:t>
             </w:r>
@@ -15133,17 +16064,15 @@
                 <w:color w:val="000000"/>
                 <w:sz w:val="28"/>
                 <w:szCs w:val="32"/>
-                <w:lang w:val="it-IT"/>
-              </w:rPr>
-              <w:t>–</w:t>
-            </w:r>
-            <w:r>
-              <w:rPr>
-                <w:rFonts w:ascii="BRH Malayalam Extra" w:hAnsi="BRH Malayalam Extra" w:cs="BRH Malayalam Extra"/>
-                <w:color w:val="000000"/>
-                <w:sz w:val="32"/>
-                <w:szCs w:val="32"/>
-                <w:lang w:val="it-IT"/>
+              </w:rPr>
+              <w:t>–</w:t>
+            </w:r>
+            <w:r>
+              <w:rPr>
+                <w:rFonts w:ascii="BRH Malayalam Extra" w:hAnsi="BRH Malayalam Extra" w:cs="BRH Malayalam Extra"/>
+                <w:color w:val="000000"/>
+                <w:sz w:val="32"/>
+                <w:szCs w:val="32"/>
               </w:rPr>
               <w:t xml:space="preserve"> CZõ¡—e - Zyrç—¥Ç | </w:t>
             </w:r>
@@ -15159,7 +16088,6 @@
                 <w:rFonts w:cs="BRH Malayalam Extra"/>
                 <w:color w:val="FF0000"/>
                 <w:szCs w:val="40"/>
-                <w:lang w:val="it-IT"/>
               </w:rPr>
             </w:pPr>
           </w:p>
@@ -15191,7 +16119,6 @@
                 <w:color w:val="000000"/>
                 <w:sz w:val="32"/>
                 <w:szCs w:val="32"/>
-                <w:lang w:val="it-IT"/>
               </w:rPr>
             </w:pPr>
             <w:r>
@@ -15200,17 +16127,16 @@
                 <w:color w:val="000000"/>
                 <w:sz w:val="32"/>
                 <w:szCs w:val="32"/>
-                <w:lang w:val="it-IT"/>
               </w:rPr>
               <w:lastRenderedPageBreak/>
               <w:t>(</w:t>
             </w:r>
-            <w:r>
-              <w:rPr>
-                <w:rFonts w:cs="BRH Malayalam Extra"/>
-                <w:color w:val="000000"/>
-                <w:szCs w:val="32"/>
-                <w:lang w:val="it-IT"/>
+            <w:proofErr w:type="gramStart"/>
+            <w:r>
+              <w:rPr>
+                <w:rFonts w:cs="BRH Malayalam Extra"/>
+                <w:color w:val="000000"/>
+                <w:szCs w:val="32"/>
               </w:rPr>
               <w:t>54</w:t>
             </w:r>
@@ -15220,16 +16146,15 @@
                 <w:color w:val="000000"/>
                 <w:sz w:val="32"/>
                 <w:szCs w:val="32"/>
-                <w:lang w:val="it-IT"/>
               </w:rPr>
               <w:t>)[</w:t>
             </w:r>
-            <w:r>
-              <w:rPr>
-                <w:rFonts w:cs="BRH Malayalam Extra"/>
-                <w:color w:val="000000"/>
-                <w:szCs w:val="32"/>
-                <w:lang w:val="it-IT"/>
+            <w:proofErr w:type="gramEnd"/>
+            <w:r>
+              <w:rPr>
+                <w:rFonts w:cs="BRH Malayalam Extra"/>
+                <w:color w:val="000000"/>
+                <w:szCs w:val="32"/>
               </w:rPr>
               <w:t>P15</w:t>
             </w:r>
@@ -15239,7 +16164,6 @@
                 <w:color w:val="000000"/>
                 <w:sz w:val="32"/>
                 <w:szCs w:val="32"/>
-                <w:lang w:val="it-IT"/>
               </w:rPr>
               <w:t xml:space="preserve">] </w:t>
             </w:r>
@@ -15248,7 +16172,6 @@
                 <w:rFonts w:cs="BRH Malayalam Extra"/>
                 <w:color w:val="000000"/>
                 <w:szCs w:val="32"/>
-                <w:lang w:val="it-IT"/>
               </w:rPr>
               <w:t>4</w:t>
             </w:r>
@@ -15258,7 +16181,6 @@
                 <w:color w:val="000000"/>
                 <w:sz w:val="32"/>
                 <w:szCs w:val="32"/>
-                <w:lang w:val="it-IT"/>
               </w:rPr>
               <w:t>.</w:t>
             </w:r>
@@ -15267,7 +16189,6 @@
                 <w:rFonts w:cs="BRH Malayalam Extra"/>
                 <w:color w:val="000000"/>
                 <w:szCs w:val="32"/>
-                <w:lang w:val="it-IT"/>
               </w:rPr>
               <w:t>2</w:t>
             </w:r>
@@ -15277,7 +16198,6 @@
                 <w:color w:val="000000"/>
                 <w:sz w:val="32"/>
                 <w:szCs w:val="32"/>
-                <w:lang w:val="it-IT"/>
               </w:rPr>
               <w:t>.</w:t>
             </w:r>
@@ -15286,7 +16206,6 @@
                 <w:rFonts w:cs="BRH Malayalam Extra"/>
                 <w:color w:val="000000"/>
                 <w:szCs w:val="32"/>
-                <w:lang w:val="it-IT"/>
               </w:rPr>
               <w:t>4</w:t>
             </w:r>
@@ -15296,7 +16215,6 @@
                 <w:color w:val="000000"/>
                 <w:sz w:val="32"/>
                 <w:szCs w:val="32"/>
-                <w:lang w:val="it-IT"/>
               </w:rPr>
               <w:t>.</w:t>
             </w:r>
@@ -15305,7 +16223,6 @@
                 <w:rFonts w:cs="BRH Malayalam Extra"/>
                 <w:color w:val="000000"/>
                 <w:szCs w:val="32"/>
-                <w:lang w:val="it-IT"/>
               </w:rPr>
               <w:t>2</w:t>
             </w:r>
@@ -15315,7 +16232,6 @@
                 <w:color w:val="000000"/>
                 <w:sz w:val="32"/>
                 <w:szCs w:val="32"/>
-                <w:lang w:val="it-IT"/>
               </w:rPr>
               <w:t>(</w:t>
             </w:r>
@@ -15324,7 +16240,6 @@
                 <w:rFonts w:cs="BRH Malayalam Extra"/>
                 <w:color w:val="000000"/>
                 <w:szCs w:val="32"/>
-                <w:lang w:val="it-IT"/>
               </w:rPr>
               <w:t>50</w:t>
             </w:r>
@@ -15334,27 +16249,44 @@
                 <w:color w:val="000000"/>
                 <w:sz w:val="32"/>
                 <w:szCs w:val="32"/>
-                <w:lang w:val="it-IT"/>
-              </w:rPr>
-              <w:t>)-  Hxr—czr¡ | A</w:t>
-            </w:r>
-            <w:r>
-              <w:rPr>
-                <w:rFonts w:ascii="BRH Malayalam Extra" w:hAnsi="BRH Malayalam Extra" w:cs="BRH Malayalam Extra"/>
-                <w:color w:val="000000"/>
-                <w:sz w:val="28"/>
-                <w:szCs w:val="32"/>
-                <w:lang w:val="it-IT"/>
-              </w:rPr>
-              <w:t>–</w:t>
-            </w:r>
-            <w:r>
-              <w:rPr>
-                <w:rFonts w:ascii="BRH Malayalam Extra" w:hAnsi="BRH Malayalam Extra" w:cs="BRH Malayalam Extra"/>
-                <w:color w:val="000000"/>
-                <w:sz w:val="32"/>
-                <w:szCs w:val="32"/>
-                <w:lang w:val="it-IT"/>
+              </w:rPr>
+              <w:t>)</w:t>
+            </w:r>
+            <w:proofErr w:type="gramStart"/>
+            <w:r>
+              <w:rPr>
+                <w:rFonts w:ascii="BRH Malayalam Extra" w:hAnsi="BRH Malayalam Extra" w:cs="BRH Malayalam Extra"/>
+                <w:color w:val="000000"/>
+                <w:sz w:val="32"/>
+                <w:szCs w:val="32"/>
+              </w:rPr>
+              <w:t>-  Hxr</w:t>
+            </w:r>
+            <w:proofErr w:type="gramEnd"/>
+            <w:r>
+              <w:rPr>
+                <w:rFonts w:ascii="BRH Malayalam Extra" w:hAnsi="BRH Malayalam Extra" w:cs="BRH Malayalam Extra"/>
+                <w:color w:val="000000"/>
+                <w:sz w:val="32"/>
+                <w:szCs w:val="32"/>
+              </w:rPr>
+              <w:t>—czr¡ | A</w:t>
+            </w:r>
+            <w:r>
+              <w:rPr>
+                <w:rFonts w:ascii="BRH Malayalam Extra" w:hAnsi="BRH Malayalam Extra" w:cs="BRH Malayalam Extra"/>
+                <w:color w:val="000000"/>
+                <w:sz w:val="28"/>
+                <w:szCs w:val="32"/>
+              </w:rPr>
+              <w:t>–</w:t>
+            </w:r>
+            <w:r>
+              <w:rPr>
+                <w:rFonts w:ascii="BRH Malayalam Extra" w:hAnsi="BRH Malayalam Extra" w:cs="BRH Malayalam Extra"/>
+                <w:color w:val="000000"/>
+                <w:sz w:val="32"/>
+                <w:szCs w:val="32"/>
               </w:rPr>
               <w:t>fþ¡ | px</w:t>
             </w:r>
@@ -15364,17 +16296,15 @@
                 <w:color w:val="000000"/>
                 <w:sz w:val="28"/>
                 <w:szCs w:val="32"/>
-                <w:lang w:val="it-IT"/>
-              </w:rPr>
-              <w:t>–</w:t>
-            </w:r>
-            <w:r>
-              <w:rPr>
-                <w:rFonts w:ascii="BRH Malayalam Extra" w:hAnsi="BRH Malayalam Extra" w:cs="BRH Malayalam Extra"/>
-                <w:color w:val="000000"/>
-                <w:sz w:val="32"/>
-                <w:szCs w:val="32"/>
-                <w:lang w:val="it-IT"/>
+              </w:rPr>
+              <w:t>–</w:t>
+            </w:r>
+            <w:r>
+              <w:rPr>
+                <w:rFonts w:ascii="BRH Malayalam Extra" w:hAnsi="BRH Malayalam Extra" w:cs="BRH Malayalam Extra"/>
+                <w:color w:val="000000"/>
+                <w:sz w:val="32"/>
+                <w:szCs w:val="32"/>
               </w:rPr>
               <w:t xml:space="preserve"> |</w:t>
             </w:r>
@@ -15391,7 +16321,6 @@
                 <w:color w:val="000000"/>
                 <w:sz w:val="32"/>
                 <w:szCs w:val="32"/>
-                <w:lang w:val="it-IT"/>
               </w:rPr>
             </w:pPr>
             <w:r>
@@ -15400,7 +16329,6 @@
                 <w:color w:val="000000"/>
                 <w:sz w:val="32"/>
                 <w:szCs w:val="32"/>
-                <w:lang w:val="it-IT"/>
               </w:rPr>
               <w:t>Hxr—cz rû</w:t>
             </w:r>
@@ -15410,17 +16338,15 @@
                 <w:color w:val="000000"/>
                 <w:sz w:val="28"/>
                 <w:szCs w:val="32"/>
-                <w:lang w:val="it-IT"/>
-              </w:rPr>
-              <w:t>–</w:t>
-            </w:r>
-            <w:r>
-              <w:rPr>
-                <w:rFonts w:ascii="BRH Malayalam Extra" w:hAnsi="BRH Malayalam Extra" w:cs="BRH Malayalam Extra"/>
-                <w:color w:val="000000"/>
-                <w:sz w:val="32"/>
-                <w:szCs w:val="32"/>
-                <w:lang w:val="it-IT"/>
+              </w:rPr>
+              <w:t>–</w:t>
+            </w:r>
+            <w:r>
+              <w:rPr>
+                <w:rFonts w:ascii="BRH Malayalam Extra" w:hAnsi="BRH Malayalam Extra" w:cs="BRH Malayalam Extra"/>
+                <w:color w:val="000000"/>
+                <w:sz w:val="32"/>
+                <w:szCs w:val="32"/>
               </w:rPr>
               <w:t>fþû— ¥fþûxr—cz</w:t>
             </w:r>
@@ -15430,17 +16356,15 @@
                 <w:color w:val="000000"/>
                 <w:sz w:val="28"/>
                 <w:szCs w:val="32"/>
-                <w:lang w:val="it-IT"/>
-              </w:rPr>
-              <w:t>–</w:t>
-            </w:r>
-            <w:r>
-              <w:rPr>
-                <w:rFonts w:ascii="BRH Malayalam Extra" w:hAnsi="BRH Malayalam Extra" w:cs="BRH Malayalam Extra"/>
-                <w:color w:val="000000"/>
-                <w:sz w:val="32"/>
-                <w:szCs w:val="32"/>
-                <w:lang w:val="it-IT"/>
+              </w:rPr>
+              <w:t>–</w:t>
+            </w:r>
+            <w:r>
+              <w:rPr>
+                <w:rFonts w:ascii="BRH Malayalam Extra" w:hAnsi="BRH Malayalam Extra" w:cs="BRH Malayalam Extra"/>
+                <w:color w:val="000000"/>
+                <w:sz w:val="32"/>
+                <w:szCs w:val="32"/>
               </w:rPr>
               <w:t xml:space="preserve"> ¥rûxr—cz rû</w:t>
             </w:r>
@@ -15450,7 +16374,6 @@
                 <w:color w:val="000000"/>
                 <w:sz w:val="28"/>
                 <w:szCs w:val="32"/>
-                <w:lang w:val="it-IT"/>
               </w:rPr>
               <w:t>–</w:t>
             </w:r>
@@ -15461,7 +16384,6 @@
                 <w:sz w:val="32"/>
                 <w:szCs w:val="32"/>
                 <w:highlight w:val="yellow"/>
-                <w:lang w:val="it-IT"/>
               </w:rPr>
               <w:t>fþûx</w:t>
             </w:r>
@@ -15471,7 +16393,6 @@
                 <w:color w:val="000000"/>
                 <w:sz w:val="32"/>
                 <w:szCs w:val="32"/>
-                <w:lang w:val="it-IT"/>
               </w:rPr>
               <w:t xml:space="preserve"> </w:t>
             </w:r>
@@ -15488,7 +16409,6 @@
                 <w:color w:val="000000"/>
                 <w:sz w:val="32"/>
                 <w:szCs w:val="32"/>
-                <w:lang w:val="it-IT"/>
               </w:rPr>
             </w:pPr>
             <w:r>
@@ -15497,7 +16417,6 @@
                 <w:color w:val="000000"/>
                 <w:sz w:val="32"/>
                 <w:szCs w:val="32"/>
-                <w:lang w:val="it-IT"/>
               </w:rPr>
               <w:t>px</w:t>
             </w:r>
@@ -15507,17 +16426,15 @@
                 <w:color w:val="000000"/>
                 <w:sz w:val="28"/>
                 <w:szCs w:val="32"/>
-                <w:lang w:val="it-IT"/>
-              </w:rPr>
-              <w:t>–</w:t>
-            </w:r>
-            <w:r>
-              <w:rPr>
-                <w:rFonts w:ascii="BRH Malayalam Extra" w:hAnsi="BRH Malayalam Extra" w:cs="BRH Malayalam Extra"/>
-                <w:color w:val="000000"/>
-                <w:sz w:val="32"/>
-                <w:szCs w:val="32"/>
-                <w:lang w:val="it-IT"/>
+              </w:rPr>
+              <w:t>–</w:t>
+            </w:r>
+            <w:r>
+              <w:rPr>
+                <w:rFonts w:ascii="BRH Malayalam Extra" w:hAnsi="BRH Malayalam Extra" w:cs="BRH Malayalam Extra"/>
+                <w:color w:val="000000"/>
+                <w:sz w:val="32"/>
+                <w:szCs w:val="32"/>
               </w:rPr>
               <w:t xml:space="preserve"> „¥fþûxr—cz</w:t>
             </w:r>
@@ -15527,17 +16444,15 @@
                 <w:color w:val="000000"/>
                 <w:sz w:val="28"/>
                 <w:szCs w:val="32"/>
-                <w:lang w:val="it-IT"/>
-              </w:rPr>
-              <w:t>–</w:t>
-            </w:r>
-            <w:r>
-              <w:rPr>
-                <w:rFonts w:ascii="BRH Malayalam Extra" w:hAnsi="BRH Malayalam Extra" w:cs="BRH Malayalam Extra"/>
-                <w:color w:val="000000"/>
-                <w:sz w:val="32"/>
-                <w:szCs w:val="32"/>
-                <w:lang w:val="it-IT"/>
+              </w:rPr>
+              <w:t>–</w:t>
+            </w:r>
+            <w:r>
+              <w:rPr>
+                <w:rFonts w:ascii="BRH Malayalam Extra" w:hAnsi="BRH Malayalam Extra" w:cs="BRH Malayalam Extra"/>
+                <w:color w:val="000000"/>
+                <w:sz w:val="32"/>
+                <w:szCs w:val="32"/>
               </w:rPr>
               <w:t xml:space="preserve"> ¥rûxr—cz rû</w:t>
             </w:r>
@@ -15547,7 +16462,6 @@
                 <w:color w:val="000000"/>
                 <w:sz w:val="28"/>
                 <w:szCs w:val="32"/>
-                <w:lang w:val="it-IT"/>
               </w:rPr>
               <w:t>–</w:t>
             </w:r>
@@ -15558,7 +16472,6 @@
                 <w:sz w:val="32"/>
                 <w:szCs w:val="32"/>
                 <w:highlight w:val="yellow"/>
-                <w:lang w:val="it-IT"/>
               </w:rPr>
               <w:t>fþûx</w:t>
             </w:r>
@@ -15568,7 +16481,6 @@
                 <w:color w:val="000000"/>
                 <w:sz w:val="32"/>
                 <w:szCs w:val="32"/>
-                <w:lang w:val="it-IT"/>
               </w:rPr>
               <w:t xml:space="preserve"> px˜ | </w:t>
             </w:r>
@@ -15585,7 +16497,6 @@
                 <w:color w:val="000000"/>
                 <w:sz w:val="32"/>
                 <w:szCs w:val="32"/>
-                <w:lang w:val="it-IT"/>
               </w:rPr>
             </w:pPr>
             <w:r>
@@ -15594,16 +16505,15 @@
                 <w:color w:val="000000"/>
                 <w:sz w:val="32"/>
                 <w:szCs w:val="32"/>
-                <w:lang w:val="it-IT"/>
               </w:rPr>
               <w:t>(</w:t>
             </w:r>
-            <w:r>
-              <w:rPr>
-                <w:rFonts w:cs="BRH Malayalam Extra"/>
-                <w:color w:val="000000"/>
-                <w:szCs w:val="32"/>
-                <w:lang w:val="it-IT"/>
+            <w:proofErr w:type="gramStart"/>
+            <w:r>
+              <w:rPr>
+                <w:rFonts w:cs="BRH Malayalam Extra"/>
+                <w:color w:val="000000"/>
+                <w:szCs w:val="32"/>
               </w:rPr>
               <w:t>1</w:t>
             </w:r>
@@ -15613,16 +16523,15 @@
                 <w:color w:val="000000"/>
                 <w:sz w:val="32"/>
                 <w:szCs w:val="32"/>
-                <w:lang w:val="it-IT"/>
               </w:rPr>
               <w:t>)[</w:t>
             </w:r>
-            <w:r>
-              <w:rPr>
-                <w:rFonts w:cs="BRH Malayalam Extra"/>
-                <w:color w:val="000000"/>
-                <w:szCs w:val="32"/>
-                <w:lang w:val="it-IT"/>
+            <w:proofErr w:type="gramEnd"/>
+            <w:r>
+              <w:rPr>
+                <w:rFonts w:cs="BRH Malayalam Extra"/>
+                <w:color w:val="000000"/>
+                <w:szCs w:val="32"/>
               </w:rPr>
               <w:t>P16</w:t>
             </w:r>
@@ -15632,7 +16541,6 @@
                 <w:color w:val="000000"/>
                 <w:sz w:val="32"/>
                 <w:szCs w:val="32"/>
-                <w:lang w:val="it-IT"/>
               </w:rPr>
               <w:t xml:space="preserve">] </w:t>
             </w:r>
@@ -15641,7 +16549,6 @@
                 <w:rFonts w:cs="BRH Malayalam Extra"/>
                 <w:color w:val="000000"/>
                 <w:szCs w:val="32"/>
-                <w:lang w:val="it-IT"/>
               </w:rPr>
               <w:t>4</w:t>
             </w:r>
@@ -15651,7 +16558,6 @@
                 <w:color w:val="000000"/>
                 <w:sz w:val="32"/>
                 <w:szCs w:val="32"/>
-                <w:lang w:val="it-IT"/>
               </w:rPr>
               <w:t>.</w:t>
             </w:r>
@@ -15660,7 +16566,6 @@
                 <w:rFonts w:cs="BRH Malayalam Extra"/>
                 <w:color w:val="000000"/>
                 <w:szCs w:val="32"/>
-                <w:lang w:val="it-IT"/>
               </w:rPr>
               <w:t>2</w:t>
             </w:r>
@@ -15670,7 +16575,6 @@
                 <w:color w:val="000000"/>
                 <w:sz w:val="32"/>
                 <w:szCs w:val="32"/>
-                <w:lang w:val="it-IT"/>
               </w:rPr>
               <w:t>.</w:t>
             </w:r>
@@ -15679,7 +16583,6 @@
                 <w:rFonts w:cs="BRH Malayalam Extra"/>
                 <w:color w:val="000000"/>
                 <w:szCs w:val="32"/>
-                <w:lang w:val="it-IT"/>
               </w:rPr>
               <w:t>4</w:t>
             </w:r>
@@ -15689,7 +16592,6 @@
                 <w:color w:val="000000"/>
                 <w:sz w:val="32"/>
                 <w:szCs w:val="32"/>
-                <w:lang w:val="it-IT"/>
               </w:rPr>
               <w:t>.</w:t>
             </w:r>
@@ -15698,7 +16600,6 @@
                 <w:rFonts w:cs="BRH Malayalam Extra"/>
                 <w:color w:val="000000"/>
                 <w:szCs w:val="32"/>
-                <w:lang w:val="it-IT"/>
               </w:rPr>
               <w:t>3</w:t>
             </w:r>
@@ -15708,7 +16609,6 @@
                 <w:color w:val="000000"/>
                 <w:sz w:val="32"/>
                 <w:szCs w:val="32"/>
-                <w:lang w:val="it-IT"/>
               </w:rPr>
               <w:t>(</w:t>
             </w:r>
@@ -15717,7 +16617,6 @@
                 <w:rFonts w:cs="BRH Malayalam Extra"/>
                 <w:color w:val="000000"/>
                 <w:szCs w:val="32"/>
-                <w:lang w:val="it-IT"/>
               </w:rPr>
               <w:t>1</w:t>
             </w:r>
@@ -15727,27 +16626,35 @@
                 <w:color w:val="000000"/>
                 <w:sz w:val="32"/>
                 <w:szCs w:val="32"/>
-                <w:lang w:val="it-IT"/>
-              </w:rPr>
-              <w:t>)-  A</w:t>
-            </w:r>
-            <w:r>
-              <w:rPr>
-                <w:rFonts w:ascii="BRH Malayalam Extra" w:hAnsi="BRH Malayalam Extra" w:cs="BRH Malayalam Extra"/>
-                <w:color w:val="000000"/>
-                <w:sz w:val="28"/>
-                <w:szCs w:val="32"/>
-                <w:lang w:val="it-IT"/>
-              </w:rPr>
-              <w:t>–</w:t>
-            </w:r>
-            <w:r>
-              <w:rPr>
-                <w:rFonts w:ascii="BRH Malayalam Extra" w:hAnsi="BRH Malayalam Extra" w:cs="BRH Malayalam Extra"/>
-                <w:color w:val="000000"/>
-                <w:sz w:val="32"/>
-                <w:szCs w:val="32"/>
-                <w:lang w:val="it-IT"/>
+              </w:rPr>
+              <w:t>)</w:t>
+            </w:r>
+            <w:proofErr w:type="gramStart"/>
+            <w:r>
+              <w:rPr>
+                <w:rFonts w:ascii="BRH Malayalam Extra" w:hAnsi="BRH Malayalam Extra" w:cs="BRH Malayalam Extra"/>
+                <w:color w:val="000000"/>
+                <w:sz w:val="32"/>
+                <w:szCs w:val="32"/>
+              </w:rPr>
+              <w:t>-  A</w:t>
+            </w:r>
+            <w:proofErr w:type="gramEnd"/>
+            <w:r>
+              <w:rPr>
+                <w:rFonts w:ascii="BRH Malayalam Extra" w:hAnsi="BRH Malayalam Extra" w:cs="BRH Malayalam Extra"/>
+                <w:color w:val="000000"/>
+                <w:sz w:val="28"/>
+                <w:szCs w:val="32"/>
+              </w:rPr>
+              <w:t>–</w:t>
+            </w:r>
+            <w:r>
+              <w:rPr>
+                <w:rFonts w:ascii="BRH Malayalam Extra" w:hAnsi="BRH Malayalam Extra" w:cs="BRH Malayalam Extra"/>
+                <w:color w:val="000000"/>
+                <w:sz w:val="32"/>
+                <w:szCs w:val="32"/>
               </w:rPr>
               <w:t>fþ¡ | px</w:t>
             </w:r>
@@ -15757,17 +16664,15 @@
                 <w:color w:val="000000"/>
                 <w:sz w:val="28"/>
                 <w:szCs w:val="32"/>
-                <w:lang w:val="it-IT"/>
-              </w:rPr>
-              <w:t>–</w:t>
-            </w:r>
-            <w:r>
-              <w:rPr>
-                <w:rFonts w:ascii="BRH Malayalam Extra" w:hAnsi="BRH Malayalam Extra" w:cs="BRH Malayalam Extra"/>
-                <w:color w:val="000000"/>
-                <w:sz w:val="32"/>
-                <w:szCs w:val="32"/>
-                <w:lang w:val="it-IT"/>
+              </w:rPr>
+              <w:t>–</w:t>
+            </w:r>
+            <w:r>
+              <w:rPr>
+                <w:rFonts w:ascii="BRH Malayalam Extra" w:hAnsi="BRH Malayalam Extra" w:cs="BRH Malayalam Extra"/>
+                <w:color w:val="000000"/>
+                <w:sz w:val="32"/>
+                <w:szCs w:val="32"/>
               </w:rPr>
               <w:t xml:space="preserve"> | j</w:t>
             </w:r>
@@ -15777,17 +16682,15 @@
                 <w:color w:val="000000"/>
                 <w:sz w:val="28"/>
                 <w:szCs w:val="32"/>
-                <w:lang w:val="it-IT"/>
-              </w:rPr>
-              <w:t>–</w:t>
-            </w:r>
-            <w:r>
-              <w:rPr>
-                <w:rFonts w:ascii="BRH Malayalam Extra" w:hAnsi="BRH Malayalam Extra" w:cs="BRH Malayalam Extra"/>
-                <w:color w:val="000000"/>
-                <w:sz w:val="32"/>
-                <w:szCs w:val="32"/>
-                <w:lang w:val="it-IT"/>
+              </w:rPr>
+              <w:t>–</w:t>
+            </w:r>
+            <w:r>
+              <w:rPr>
+                <w:rFonts w:ascii="BRH Malayalam Extra" w:hAnsi="BRH Malayalam Extra" w:cs="BRH Malayalam Extra"/>
+                <w:color w:val="000000"/>
+                <w:sz w:val="32"/>
+                <w:szCs w:val="32"/>
               </w:rPr>
               <w:t>R</w:t>
             </w:r>
@@ -15797,17 +16700,15 @@
                 <w:color w:val="000000"/>
                 <w:sz w:val="28"/>
                 <w:szCs w:val="32"/>
-                <w:lang w:val="it-IT"/>
-              </w:rPr>
-              <w:t>–</w:t>
-            </w:r>
-            <w:r>
-              <w:rPr>
-                <w:rFonts w:ascii="BRH Malayalam Extra" w:hAnsi="BRH Malayalam Extra" w:cs="BRH Malayalam Extra"/>
-                <w:color w:val="000000"/>
-                <w:sz w:val="32"/>
-                <w:szCs w:val="32"/>
-                <w:lang w:val="it-IT"/>
+              </w:rPr>
+              <w:t>–</w:t>
+            </w:r>
+            <w:r>
+              <w:rPr>
+                <w:rFonts w:ascii="BRH Malayalam Extra" w:hAnsi="BRH Malayalam Extra" w:cs="BRH Malayalam Extra"/>
+                <w:color w:val="000000"/>
+                <w:sz w:val="32"/>
+                <w:szCs w:val="32"/>
               </w:rPr>
               <w:t>öZ</w:t>
             </w:r>
@@ -15817,17 +16718,15 @@
                 <w:color w:val="000000"/>
                 <w:sz w:val="28"/>
                 <w:szCs w:val="32"/>
-                <w:lang w:val="it-IT"/>
-              </w:rPr>
-              <w:t>–</w:t>
-            </w:r>
-            <w:r>
-              <w:rPr>
-                <w:rFonts w:ascii="BRH Malayalam Extra" w:hAnsi="BRH Malayalam Extra" w:cs="BRH Malayalam Extra"/>
-                <w:color w:val="000000"/>
-                <w:sz w:val="32"/>
-                <w:szCs w:val="32"/>
-                <w:lang w:val="it-IT"/>
+              </w:rPr>
+              <w:t>–</w:t>
+            </w:r>
+            <w:r>
+              <w:rPr>
+                <w:rFonts w:ascii="BRH Malayalam Extra" w:hAnsi="BRH Malayalam Extra" w:cs="BRH Malayalam Extra"/>
+                <w:color w:val="000000"/>
+                <w:sz w:val="32"/>
+                <w:szCs w:val="32"/>
               </w:rPr>
               <w:t xml:space="preserve"> ||</w:t>
             </w:r>
@@ -15843,7 +16742,6 @@
                 <w:rFonts w:cs="BRH Malayalam Extra"/>
                 <w:color w:val="FF0000"/>
                 <w:szCs w:val="40"/>
-                <w:lang w:val="it-IT"/>
               </w:rPr>
             </w:pPr>
             <w:r>
@@ -15852,7 +16750,6 @@
                 <w:color w:val="000000"/>
                 <w:sz w:val="32"/>
                 <w:szCs w:val="32"/>
-                <w:lang w:val="it-IT"/>
               </w:rPr>
               <w:t>A</w:t>
             </w:r>
@@ -15862,7 +16759,6 @@
                 <w:color w:val="000000"/>
                 <w:sz w:val="28"/>
                 <w:szCs w:val="32"/>
-                <w:lang w:val="it-IT"/>
               </w:rPr>
               <w:t>–</w:t>
             </w:r>
@@ -15873,7 +16769,6 @@
                 <w:sz w:val="32"/>
                 <w:szCs w:val="32"/>
                 <w:highlight w:val="yellow"/>
-                <w:lang w:val="it-IT"/>
               </w:rPr>
               <w:t>fþûx</w:t>
             </w:r>
@@ -15884,17 +16779,15 @@
                 <w:sz w:val="28"/>
                 <w:szCs w:val="32"/>
                 <w:highlight w:val="yellow"/>
-                <w:lang w:val="it-IT"/>
-              </w:rPr>
-              <w:t>–</w:t>
-            </w:r>
-            <w:r>
-              <w:rPr>
-                <w:rFonts w:ascii="BRH Malayalam Extra" w:hAnsi="BRH Malayalam Extra" w:cs="BRH Malayalam Extra"/>
-                <w:color w:val="000000"/>
-                <w:sz w:val="32"/>
-                <w:szCs w:val="32"/>
-                <w:lang w:val="it-IT"/>
+              </w:rPr>
+              <w:t>–</w:t>
+            </w:r>
+            <w:r>
+              <w:rPr>
+                <w:rFonts w:ascii="BRH Malayalam Extra" w:hAnsi="BRH Malayalam Extra" w:cs="BRH Malayalam Extra"/>
+                <w:color w:val="000000"/>
+                <w:sz w:val="32"/>
+                <w:szCs w:val="32"/>
               </w:rPr>
               <w:t xml:space="preserve"> px</w:t>
             </w:r>
@@ -15904,17 +16797,15 @@
                 <w:color w:val="000000"/>
                 <w:sz w:val="28"/>
                 <w:szCs w:val="32"/>
-                <w:lang w:val="it-IT"/>
-              </w:rPr>
-              <w:t>–</w:t>
-            </w:r>
-            <w:r>
-              <w:rPr>
-                <w:rFonts w:ascii="BRH Malayalam Extra" w:hAnsi="BRH Malayalam Extra" w:cs="BRH Malayalam Extra"/>
-                <w:color w:val="000000"/>
-                <w:sz w:val="32"/>
-                <w:szCs w:val="32"/>
-                <w:lang w:val="it-IT"/>
+              </w:rPr>
+              <w:t>–</w:t>
+            </w:r>
+            <w:r>
+              <w:rPr>
+                <w:rFonts w:ascii="BRH Malayalam Extra" w:hAnsi="BRH Malayalam Extra" w:cs="BRH Malayalam Extra"/>
+                <w:color w:val="000000"/>
+                <w:sz w:val="32"/>
+                <w:szCs w:val="32"/>
               </w:rPr>
               <w:t xml:space="preserve"> „fþû—</w:t>
             </w:r>
@@ -15925,7 +16816,6 @@
                 <w:sz w:val="32"/>
                 <w:szCs w:val="32"/>
                 <w:highlight w:val="yellow"/>
-                <w:lang w:val="it-IT"/>
               </w:rPr>
               <w:t>fþûx</w:t>
             </w:r>
@@ -15935,7 +16825,6 @@
                 <w:color w:val="000000"/>
                 <w:sz w:val="32"/>
                 <w:szCs w:val="32"/>
-                <w:lang w:val="it-IT"/>
               </w:rPr>
               <w:t xml:space="preserve"> jRöZ jRöZ px</w:t>
             </w:r>
@@ -15945,17 +16834,15 @@
                 <w:color w:val="000000"/>
                 <w:sz w:val="28"/>
                 <w:szCs w:val="32"/>
-                <w:lang w:val="it-IT"/>
-              </w:rPr>
-              <w:t>–</w:t>
-            </w:r>
-            <w:r>
-              <w:rPr>
-                <w:rFonts w:ascii="BRH Malayalam Extra" w:hAnsi="BRH Malayalam Extra" w:cs="BRH Malayalam Extra"/>
-                <w:color w:val="000000"/>
-                <w:sz w:val="32"/>
-                <w:szCs w:val="32"/>
-                <w:lang w:val="it-IT"/>
+              </w:rPr>
+              <w:t>–</w:t>
+            </w:r>
+            <w:r>
+              <w:rPr>
+                <w:rFonts w:ascii="BRH Malayalam Extra" w:hAnsi="BRH Malayalam Extra" w:cs="BRH Malayalam Extra"/>
+                <w:color w:val="000000"/>
+                <w:sz w:val="32"/>
+                <w:szCs w:val="32"/>
               </w:rPr>
               <w:t xml:space="preserve"> „fþû—</w:t>
             </w:r>
@@ -15966,7 +16853,6 @@
                 <w:sz w:val="32"/>
                 <w:szCs w:val="32"/>
                 <w:highlight w:val="yellow"/>
-                <w:lang w:val="it-IT"/>
               </w:rPr>
               <w:t>fþûx</w:t>
             </w:r>
@@ -15976,7 +16862,6 @@
                 <w:color w:val="000000"/>
                 <w:sz w:val="32"/>
                 <w:szCs w:val="32"/>
-                <w:lang w:val="it-IT"/>
               </w:rPr>
               <w:t xml:space="preserve"> jRöZ | </w:t>
             </w:r>
@@ -16004,7 +16889,6 @@
                 <w:color w:val="000000"/>
                 <w:sz w:val="32"/>
                 <w:szCs w:val="32"/>
-                <w:lang w:val="it-IT"/>
               </w:rPr>
             </w:pPr>
             <w:r>
@@ -16013,16 +16897,15 @@
                 <w:color w:val="000000"/>
                 <w:sz w:val="32"/>
                 <w:szCs w:val="32"/>
-                <w:lang w:val="it-IT"/>
               </w:rPr>
               <w:t>(</w:t>
             </w:r>
-            <w:r>
-              <w:rPr>
-                <w:rFonts w:cs="BRH Malayalam Extra"/>
-                <w:color w:val="000000"/>
-                <w:szCs w:val="32"/>
-                <w:lang w:val="it-IT"/>
+            <w:proofErr w:type="gramStart"/>
+            <w:r>
+              <w:rPr>
+                <w:rFonts w:cs="BRH Malayalam Extra"/>
+                <w:color w:val="000000"/>
+                <w:szCs w:val="32"/>
               </w:rPr>
               <w:t>54</w:t>
             </w:r>
@@ -16032,16 +16915,15 @@
                 <w:color w:val="000000"/>
                 <w:sz w:val="32"/>
                 <w:szCs w:val="32"/>
-                <w:lang w:val="it-IT"/>
               </w:rPr>
               <w:t>)[</w:t>
             </w:r>
-            <w:r>
-              <w:rPr>
-                <w:rFonts w:cs="BRH Malayalam Extra"/>
-                <w:color w:val="000000"/>
-                <w:szCs w:val="32"/>
-                <w:lang w:val="it-IT"/>
+            <w:proofErr w:type="gramEnd"/>
+            <w:r>
+              <w:rPr>
+                <w:rFonts w:cs="BRH Malayalam Extra"/>
+                <w:color w:val="000000"/>
+                <w:szCs w:val="32"/>
               </w:rPr>
               <w:t>P15</w:t>
             </w:r>
@@ -16051,7 +16933,6 @@
                 <w:color w:val="000000"/>
                 <w:sz w:val="32"/>
                 <w:szCs w:val="32"/>
-                <w:lang w:val="it-IT"/>
               </w:rPr>
               <w:t xml:space="preserve">] </w:t>
             </w:r>
@@ -16060,7 +16941,6 @@
                 <w:rFonts w:cs="BRH Malayalam Extra"/>
                 <w:color w:val="000000"/>
                 <w:szCs w:val="32"/>
-                <w:lang w:val="it-IT"/>
               </w:rPr>
               <w:t>4</w:t>
             </w:r>
@@ -16070,7 +16950,6 @@
                 <w:color w:val="000000"/>
                 <w:sz w:val="32"/>
                 <w:szCs w:val="32"/>
-                <w:lang w:val="it-IT"/>
               </w:rPr>
               <w:t>.</w:t>
             </w:r>
@@ -16079,7 +16958,6 @@
                 <w:rFonts w:cs="BRH Malayalam Extra"/>
                 <w:color w:val="000000"/>
                 <w:szCs w:val="32"/>
-                <w:lang w:val="it-IT"/>
               </w:rPr>
               <w:t>2</w:t>
             </w:r>
@@ -16089,7 +16967,6 @@
                 <w:color w:val="000000"/>
                 <w:sz w:val="32"/>
                 <w:szCs w:val="32"/>
-                <w:lang w:val="it-IT"/>
               </w:rPr>
               <w:t>.</w:t>
             </w:r>
@@ -16098,7 +16975,6 @@
                 <w:rFonts w:cs="BRH Malayalam Extra"/>
                 <w:color w:val="000000"/>
                 <w:szCs w:val="32"/>
-                <w:lang w:val="it-IT"/>
               </w:rPr>
               <w:t>4</w:t>
             </w:r>
@@ -16108,7 +16984,6 @@
                 <w:color w:val="000000"/>
                 <w:sz w:val="32"/>
                 <w:szCs w:val="32"/>
-                <w:lang w:val="it-IT"/>
               </w:rPr>
               <w:t>.</w:t>
             </w:r>
@@ -16117,7 +16992,6 @@
                 <w:rFonts w:cs="BRH Malayalam Extra"/>
                 <w:color w:val="000000"/>
                 <w:szCs w:val="32"/>
-                <w:lang w:val="it-IT"/>
               </w:rPr>
               <w:t>2</w:t>
             </w:r>
@@ -16127,7 +17001,6 @@
                 <w:color w:val="000000"/>
                 <w:sz w:val="32"/>
                 <w:szCs w:val="32"/>
-                <w:lang w:val="it-IT"/>
               </w:rPr>
               <w:t>(</w:t>
             </w:r>
@@ -16136,7 +17009,6 @@
                 <w:rFonts w:cs="BRH Malayalam Extra"/>
                 <w:color w:val="000000"/>
                 <w:szCs w:val="32"/>
-                <w:lang w:val="it-IT"/>
               </w:rPr>
               <w:t>50</w:t>
             </w:r>
@@ -16146,27 +17018,44 @@
                 <w:color w:val="000000"/>
                 <w:sz w:val="32"/>
                 <w:szCs w:val="32"/>
-                <w:lang w:val="it-IT"/>
-              </w:rPr>
-              <w:t>)-  Hxr—czr¡ | A</w:t>
-            </w:r>
-            <w:r>
-              <w:rPr>
-                <w:rFonts w:ascii="BRH Malayalam Extra" w:hAnsi="BRH Malayalam Extra" w:cs="BRH Malayalam Extra"/>
-                <w:color w:val="000000"/>
-                <w:sz w:val="28"/>
-                <w:szCs w:val="32"/>
-                <w:lang w:val="it-IT"/>
-              </w:rPr>
-              <w:t>–</w:t>
-            </w:r>
-            <w:r>
-              <w:rPr>
-                <w:rFonts w:ascii="BRH Malayalam Extra" w:hAnsi="BRH Malayalam Extra" w:cs="BRH Malayalam Extra"/>
-                <w:color w:val="000000"/>
-                <w:sz w:val="32"/>
-                <w:szCs w:val="32"/>
-                <w:lang w:val="it-IT"/>
+              </w:rPr>
+              <w:t>)</w:t>
+            </w:r>
+            <w:proofErr w:type="gramStart"/>
+            <w:r>
+              <w:rPr>
+                <w:rFonts w:ascii="BRH Malayalam Extra" w:hAnsi="BRH Malayalam Extra" w:cs="BRH Malayalam Extra"/>
+                <w:color w:val="000000"/>
+                <w:sz w:val="32"/>
+                <w:szCs w:val="32"/>
+              </w:rPr>
+              <w:t>-  Hxr</w:t>
+            </w:r>
+            <w:proofErr w:type="gramEnd"/>
+            <w:r>
+              <w:rPr>
+                <w:rFonts w:ascii="BRH Malayalam Extra" w:hAnsi="BRH Malayalam Extra" w:cs="BRH Malayalam Extra"/>
+                <w:color w:val="000000"/>
+                <w:sz w:val="32"/>
+                <w:szCs w:val="32"/>
+              </w:rPr>
+              <w:t>—czr¡ | A</w:t>
+            </w:r>
+            <w:r>
+              <w:rPr>
+                <w:rFonts w:ascii="BRH Malayalam Extra" w:hAnsi="BRH Malayalam Extra" w:cs="BRH Malayalam Extra"/>
+                <w:color w:val="000000"/>
+                <w:sz w:val="28"/>
+                <w:szCs w:val="32"/>
+              </w:rPr>
+              <w:t>–</w:t>
+            </w:r>
+            <w:r>
+              <w:rPr>
+                <w:rFonts w:ascii="BRH Malayalam Extra" w:hAnsi="BRH Malayalam Extra" w:cs="BRH Malayalam Extra"/>
+                <w:color w:val="000000"/>
+                <w:sz w:val="32"/>
+                <w:szCs w:val="32"/>
               </w:rPr>
               <w:t>fþ¡ | px</w:t>
             </w:r>
@@ -16176,17 +17065,15 @@
                 <w:color w:val="000000"/>
                 <w:sz w:val="28"/>
                 <w:szCs w:val="32"/>
-                <w:lang w:val="it-IT"/>
-              </w:rPr>
-              <w:t>–</w:t>
-            </w:r>
-            <w:r>
-              <w:rPr>
-                <w:rFonts w:ascii="BRH Malayalam Extra" w:hAnsi="BRH Malayalam Extra" w:cs="BRH Malayalam Extra"/>
-                <w:color w:val="000000"/>
-                <w:sz w:val="32"/>
-                <w:szCs w:val="32"/>
-                <w:lang w:val="it-IT"/>
+              </w:rPr>
+              <w:t>–</w:t>
+            </w:r>
+            <w:r>
+              <w:rPr>
+                <w:rFonts w:ascii="BRH Malayalam Extra" w:hAnsi="BRH Malayalam Extra" w:cs="BRH Malayalam Extra"/>
+                <w:color w:val="000000"/>
+                <w:sz w:val="32"/>
+                <w:szCs w:val="32"/>
               </w:rPr>
               <w:t xml:space="preserve"> |</w:t>
             </w:r>
@@ -16204,7 +17091,6 @@
                 <w:sz w:val="32"/>
                 <w:szCs w:val="32"/>
                 <w:highlight w:val="green"/>
-                <w:lang w:val="it-IT"/>
               </w:rPr>
             </w:pPr>
             <w:r>
@@ -16213,7 +17099,6 @@
                 <w:color w:val="000000"/>
                 <w:sz w:val="32"/>
                 <w:szCs w:val="32"/>
-                <w:lang w:val="it-IT"/>
               </w:rPr>
               <w:t>Hxr—cz rû</w:t>
             </w:r>
@@ -16223,17 +17108,15 @@
                 <w:color w:val="000000"/>
                 <w:sz w:val="28"/>
                 <w:szCs w:val="32"/>
-                <w:lang w:val="it-IT"/>
-              </w:rPr>
-              <w:t>–</w:t>
-            </w:r>
-            <w:r>
-              <w:rPr>
-                <w:rFonts w:ascii="BRH Malayalam Extra" w:hAnsi="BRH Malayalam Extra" w:cs="BRH Malayalam Extra"/>
-                <w:color w:val="000000"/>
-                <w:sz w:val="32"/>
-                <w:szCs w:val="32"/>
-                <w:lang w:val="it-IT"/>
+              </w:rPr>
+              <w:t>–</w:t>
+            </w:r>
+            <w:r>
+              <w:rPr>
+                <w:rFonts w:ascii="BRH Malayalam Extra" w:hAnsi="BRH Malayalam Extra" w:cs="BRH Malayalam Extra"/>
+                <w:color w:val="000000"/>
+                <w:sz w:val="32"/>
+                <w:szCs w:val="32"/>
               </w:rPr>
               <w:t>fþû— ¥fþûxr—cz</w:t>
             </w:r>
@@ -16243,17 +17126,15 @@
                 <w:color w:val="000000"/>
                 <w:sz w:val="28"/>
                 <w:szCs w:val="32"/>
-                <w:lang w:val="it-IT"/>
-              </w:rPr>
-              <w:t>–</w:t>
-            </w:r>
-            <w:r>
-              <w:rPr>
-                <w:rFonts w:ascii="BRH Malayalam Extra" w:hAnsi="BRH Malayalam Extra" w:cs="BRH Malayalam Extra"/>
-                <w:color w:val="000000"/>
-                <w:sz w:val="32"/>
-                <w:szCs w:val="32"/>
-                <w:lang w:val="it-IT"/>
+              </w:rPr>
+              <w:t>–</w:t>
+            </w:r>
+            <w:r>
+              <w:rPr>
+                <w:rFonts w:ascii="BRH Malayalam Extra" w:hAnsi="BRH Malayalam Extra" w:cs="BRH Malayalam Extra"/>
+                <w:color w:val="000000"/>
+                <w:sz w:val="32"/>
+                <w:szCs w:val="32"/>
               </w:rPr>
               <w:t xml:space="preserve"> ¥rûxr—cz rû</w:t>
             </w:r>
@@ -16263,7 +17144,6 @@
                 <w:color w:val="000000"/>
                 <w:sz w:val="28"/>
                 <w:szCs w:val="32"/>
-                <w:lang w:val="it-IT"/>
               </w:rPr>
               <w:t>–</w:t>
             </w:r>
@@ -16274,7 +17154,6 @@
                 <w:sz w:val="32"/>
                 <w:szCs w:val="32"/>
                 <w:highlight w:val="green"/>
-                <w:lang w:val="it-IT"/>
               </w:rPr>
               <w:t xml:space="preserve">fþ¡ </w:t>
             </w:r>
@@ -16291,7 +17170,6 @@
                 <w:color w:val="000000"/>
                 <w:sz w:val="32"/>
                 <w:szCs w:val="32"/>
-                <w:lang w:val="it-IT"/>
               </w:rPr>
             </w:pPr>
             <w:r>
@@ -16301,7 +17179,6 @@
                 <w:sz w:val="32"/>
                 <w:szCs w:val="32"/>
                 <w:highlight w:val="green"/>
-                <w:lang w:val="it-IT"/>
               </w:rPr>
               <w:t>px</w:t>
             </w:r>
@@ -16311,7 +17188,6 @@
                 <w:color w:val="000000"/>
                 <w:sz w:val="32"/>
                 <w:szCs w:val="32"/>
-                <w:lang w:val="it-IT"/>
               </w:rPr>
               <w:t>— px</w:t>
             </w:r>
@@ -16321,17 +17197,15 @@
                 <w:color w:val="000000"/>
                 <w:sz w:val="28"/>
                 <w:szCs w:val="32"/>
-                <w:lang w:val="it-IT"/>
-              </w:rPr>
-              <w:t>–</w:t>
-            </w:r>
-            <w:r>
-              <w:rPr>
-                <w:rFonts w:ascii="BRH Malayalam Extra" w:hAnsi="BRH Malayalam Extra" w:cs="BRH Malayalam Extra"/>
-                <w:color w:val="000000"/>
-                <w:sz w:val="32"/>
-                <w:szCs w:val="32"/>
-                <w:lang w:val="it-IT"/>
+              </w:rPr>
+              <w:t>–</w:t>
+            </w:r>
+            <w:r>
+              <w:rPr>
+                <w:rFonts w:ascii="BRH Malayalam Extra" w:hAnsi="BRH Malayalam Extra" w:cs="BRH Malayalam Extra"/>
+                <w:color w:val="000000"/>
+                <w:sz w:val="32"/>
+                <w:szCs w:val="32"/>
               </w:rPr>
               <w:t xml:space="preserve"> „¥fþûxr—cz</w:t>
             </w:r>
@@ -16341,17 +17215,15 @@
                 <w:color w:val="000000"/>
                 <w:sz w:val="28"/>
                 <w:szCs w:val="32"/>
-                <w:lang w:val="it-IT"/>
-              </w:rPr>
-              <w:t>–</w:t>
-            </w:r>
-            <w:r>
-              <w:rPr>
-                <w:rFonts w:ascii="BRH Malayalam Extra" w:hAnsi="BRH Malayalam Extra" w:cs="BRH Malayalam Extra"/>
-                <w:color w:val="000000"/>
-                <w:sz w:val="32"/>
-                <w:szCs w:val="32"/>
-                <w:lang w:val="it-IT"/>
+              </w:rPr>
+              <w:t>–</w:t>
+            </w:r>
+            <w:r>
+              <w:rPr>
+                <w:rFonts w:ascii="BRH Malayalam Extra" w:hAnsi="BRH Malayalam Extra" w:cs="BRH Malayalam Extra"/>
+                <w:color w:val="000000"/>
+                <w:sz w:val="32"/>
+                <w:szCs w:val="32"/>
               </w:rPr>
               <w:t xml:space="preserve"> ¥rûxr—cz rû</w:t>
             </w:r>
@@ -16361,7 +17233,6 @@
                 <w:color w:val="000000"/>
                 <w:sz w:val="28"/>
                 <w:szCs w:val="32"/>
-                <w:lang w:val="it-IT"/>
               </w:rPr>
               <w:t>–</w:t>
             </w:r>
@@ -16372,7 +17243,6 @@
                 <w:sz w:val="32"/>
                 <w:szCs w:val="32"/>
                 <w:highlight w:val="green"/>
-                <w:lang w:val="it-IT"/>
               </w:rPr>
               <w:t>fþ¡</w:t>
             </w:r>
@@ -16382,7 +17252,6 @@
                 <w:color w:val="000000"/>
                 <w:sz w:val="32"/>
                 <w:szCs w:val="32"/>
-                <w:lang w:val="it-IT"/>
               </w:rPr>
               <w:t xml:space="preserve"> px˜ | </w:t>
             </w:r>
@@ -16399,7 +17268,6 @@
                 <w:color w:val="000000"/>
                 <w:sz w:val="32"/>
                 <w:szCs w:val="32"/>
-                <w:lang w:val="it-IT"/>
               </w:rPr>
             </w:pPr>
             <w:r>
@@ -16408,16 +17276,15 @@
                 <w:color w:val="000000"/>
                 <w:sz w:val="32"/>
                 <w:szCs w:val="32"/>
-                <w:lang w:val="it-IT"/>
               </w:rPr>
               <w:t>(</w:t>
             </w:r>
-            <w:r>
-              <w:rPr>
-                <w:rFonts w:cs="BRH Malayalam Extra"/>
-                <w:color w:val="000000"/>
-                <w:szCs w:val="32"/>
-                <w:lang w:val="it-IT"/>
+            <w:proofErr w:type="gramStart"/>
+            <w:r>
+              <w:rPr>
+                <w:rFonts w:cs="BRH Malayalam Extra"/>
+                <w:color w:val="000000"/>
+                <w:szCs w:val="32"/>
               </w:rPr>
               <w:t>1</w:t>
             </w:r>
@@ -16427,16 +17294,15 @@
                 <w:color w:val="000000"/>
                 <w:sz w:val="32"/>
                 <w:szCs w:val="32"/>
-                <w:lang w:val="it-IT"/>
               </w:rPr>
               <w:t>)[</w:t>
             </w:r>
-            <w:r>
-              <w:rPr>
-                <w:rFonts w:cs="BRH Malayalam Extra"/>
-                <w:color w:val="000000"/>
-                <w:szCs w:val="32"/>
-                <w:lang w:val="it-IT"/>
+            <w:proofErr w:type="gramEnd"/>
+            <w:r>
+              <w:rPr>
+                <w:rFonts w:cs="BRH Malayalam Extra"/>
+                <w:color w:val="000000"/>
+                <w:szCs w:val="32"/>
               </w:rPr>
               <w:t>P16</w:t>
             </w:r>
@@ -16446,7 +17312,6 @@
                 <w:color w:val="000000"/>
                 <w:sz w:val="32"/>
                 <w:szCs w:val="32"/>
-                <w:lang w:val="it-IT"/>
               </w:rPr>
               <w:t xml:space="preserve">] </w:t>
             </w:r>
@@ -16455,7 +17320,6 @@
                 <w:rFonts w:cs="BRH Malayalam Extra"/>
                 <w:color w:val="000000"/>
                 <w:szCs w:val="32"/>
-                <w:lang w:val="it-IT"/>
               </w:rPr>
               <w:t>4</w:t>
             </w:r>
@@ -16465,7 +17329,6 @@
                 <w:color w:val="000000"/>
                 <w:sz w:val="32"/>
                 <w:szCs w:val="32"/>
-                <w:lang w:val="it-IT"/>
               </w:rPr>
               <w:t>.</w:t>
             </w:r>
@@ -16474,7 +17337,6 @@
                 <w:rFonts w:cs="BRH Malayalam Extra"/>
                 <w:color w:val="000000"/>
                 <w:szCs w:val="32"/>
-                <w:lang w:val="it-IT"/>
               </w:rPr>
               <w:t>2</w:t>
             </w:r>
@@ -16484,7 +17346,6 @@
                 <w:color w:val="000000"/>
                 <w:sz w:val="32"/>
                 <w:szCs w:val="32"/>
-                <w:lang w:val="it-IT"/>
               </w:rPr>
               <w:t>.</w:t>
             </w:r>
@@ -16493,7 +17354,6 @@
                 <w:rFonts w:cs="BRH Malayalam Extra"/>
                 <w:color w:val="000000"/>
                 <w:szCs w:val="32"/>
-                <w:lang w:val="it-IT"/>
               </w:rPr>
               <w:t>4</w:t>
             </w:r>
@@ -16503,7 +17363,6 @@
                 <w:color w:val="000000"/>
                 <w:sz w:val="32"/>
                 <w:szCs w:val="32"/>
-                <w:lang w:val="it-IT"/>
               </w:rPr>
               <w:t>.</w:t>
             </w:r>
@@ -16512,7 +17371,6 @@
                 <w:rFonts w:cs="BRH Malayalam Extra"/>
                 <w:color w:val="000000"/>
                 <w:szCs w:val="32"/>
-                <w:lang w:val="it-IT"/>
               </w:rPr>
               <w:t>3</w:t>
             </w:r>
@@ -16522,7 +17380,6 @@
                 <w:color w:val="000000"/>
                 <w:sz w:val="32"/>
                 <w:szCs w:val="32"/>
-                <w:lang w:val="it-IT"/>
               </w:rPr>
               <w:t>(</w:t>
             </w:r>
@@ -16531,7 +17388,6 @@
                 <w:rFonts w:cs="BRH Malayalam Extra"/>
                 <w:color w:val="000000"/>
                 <w:szCs w:val="32"/>
-                <w:lang w:val="it-IT"/>
               </w:rPr>
               <w:t>1</w:t>
             </w:r>
@@ -16541,27 +17397,35 @@
                 <w:color w:val="000000"/>
                 <w:sz w:val="32"/>
                 <w:szCs w:val="32"/>
-                <w:lang w:val="it-IT"/>
-              </w:rPr>
-              <w:t>)-  A</w:t>
-            </w:r>
-            <w:r>
-              <w:rPr>
-                <w:rFonts w:ascii="BRH Malayalam Extra" w:hAnsi="BRH Malayalam Extra" w:cs="BRH Malayalam Extra"/>
-                <w:color w:val="000000"/>
-                <w:sz w:val="28"/>
-                <w:szCs w:val="32"/>
-                <w:lang w:val="it-IT"/>
-              </w:rPr>
-              <w:t>–</w:t>
-            </w:r>
-            <w:r>
-              <w:rPr>
-                <w:rFonts w:ascii="BRH Malayalam Extra" w:hAnsi="BRH Malayalam Extra" w:cs="BRH Malayalam Extra"/>
-                <w:color w:val="000000"/>
-                <w:sz w:val="32"/>
-                <w:szCs w:val="32"/>
-                <w:lang w:val="it-IT"/>
+              </w:rPr>
+              <w:t>)</w:t>
+            </w:r>
+            <w:proofErr w:type="gramStart"/>
+            <w:r>
+              <w:rPr>
+                <w:rFonts w:ascii="BRH Malayalam Extra" w:hAnsi="BRH Malayalam Extra" w:cs="BRH Malayalam Extra"/>
+                <w:color w:val="000000"/>
+                <w:sz w:val="32"/>
+                <w:szCs w:val="32"/>
+              </w:rPr>
+              <w:t>-  A</w:t>
+            </w:r>
+            <w:proofErr w:type="gramEnd"/>
+            <w:r>
+              <w:rPr>
+                <w:rFonts w:ascii="BRH Malayalam Extra" w:hAnsi="BRH Malayalam Extra" w:cs="BRH Malayalam Extra"/>
+                <w:color w:val="000000"/>
+                <w:sz w:val="28"/>
+                <w:szCs w:val="32"/>
+              </w:rPr>
+              <w:t>–</w:t>
+            </w:r>
+            <w:r>
+              <w:rPr>
+                <w:rFonts w:ascii="BRH Malayalam Extra" w:hAnsi="BRH Malayalam Extra" w:cs="BRH Malayalam Extra"/>
+                <w:color w:val="000000"/>
+                <w:sz w:val="32"/>
+                <w:szCs w:val="32"/>
               </w:rPr>
               <w:t>fþ¡ | px</w:t>
             </w:r>
@@ -16571,17 +17435,15 @@
                 <w:color w:val="000000"/>
                 <w:sz w:val="28"/>
                 <w:szCs w:val="32"/>
-                <w:lang w:val="it-IT"/>
-              </w:rPr>
-              <w:t>–</w:t>
-            </w:r>
-            <w:r>
-              <w:rPr>
-                <w:rFonts w:ascii="BRH Malayalam Extra" w:hAnsi="BRH Malayalam Extra" w:cs="BRH Malayalam Extra"/>
-                <w:color w:val="000000"/>
-                <w:sz w:val="32"/>
-                <w:szCs w:val="32"/>
-                <w:lang w:val="it-IT"/>
+              </w:rPr>
+              <w:t>–</w:t>
+            </w:r>
+            <w:r>
+              <w:rPr>
+                <w:rFonts w:ascii="BRH Malayalam Extra" w:hAnsi="BRH Malayalam Extra" w:cs="BRH Malayalam Extra"/>
+                <w:color w:val="000000"/>
+                <w:sz w:val="32"/>
+                <w:szCs w:val="32"/>
               </w:rPr>
               <w:t xml:space="preserve"> | j</w:t>
             </w:r>
@@ -16591,17 +17453,15 @@
                 <w:color w:val="000000"/>
                 <w:sz w:val="28"/>
                 <w:szCs w:val="32"/>
-                <w:lang w:val="it-IT"/>
-              </w:rPr>
-              <w:t>–</w:t>
-            </w:r>
-            <w:r>
-              <w:rPr>
-                <w:rFonts w:ascii="BRH Malayalam Extra" w:hAnsi="BRH Malayalam Extra" w:cs="BRH Malayalam Extra"/>
-                <w:color w:val="000000"/>
-                <w:sz w:val="32"/>
-                <w:szCs w:val="32"/>
-                <w:lang w:val="it-IT"/>
+              </w:rPr>
+              <w:t>–</w:t>
+            </w:r>
+            <w:r>
+              <w:rPr>
+                <w:rFonts w:ascii="BRH Malayalam Extra" w:hAnsi="BRH Malayalam Extra" w:cs="BRH Malayalam Extra"/>
+                <w:color w:val="000000"/>
+                <w:sz w:val="32"/>
+                <w:szCs w:val="32"/>
               </w:rPr>
               <w:t>R</w:t>
             </w:r>
@@ -16611,17 +17471,15 @@
                 <w:color w:val="000000"/>
                 <w:sz w:val="28"/>
                 <w:szCs w:val="32"/>
-                <w:lang w:val="it-IT"/>
-              </w:rPr>
-              <w:t>–</w:t>
-            </w:r>
-            <w:r>
-              <w:rPr>
-                <w:rFonts w:ascii="BRH Malayalam Extra" w:hAnsi="BRH Malayalam Extra" w:cs="BRH Malayalam Extra"/>
-                <w:color w:val="000000"/>
-                <w:sz w:val="32"/>
-                <w:szCs w:val="32"/>
-                <w:lang w:val="it-IT"/>
+              </w:rPr>
+              <w:t>–</w:t>
+            </w:r>
+            <w:r>
+              <w:rPr>
+                <w:rFonts w:ascii="BRH Malayalam Extra" w:hAnsi="BRH Malayalam Extra" w:cs="BRH Malayalam Extra"/>
+                <w:color w:val="000000"/>
+                <w:sz w:val="32"/>
+                <w:szCs w:val="32"/>
               </w:rPr>
               <w:t>öZ</w:t>
             </w:r>
@@ -16631,17 +17489,15 @@
                 <w:color w:val="000000"/>
                 <w:sz w:val="28"/>
                 <w:szCs w:val="32"/>
-                <w:lang w:val="it-IT"/>
-              </w:rPr>
-              <w:t>–</w:t>
-            </w:r>
-            <w:r>
-              <w:rPr>
-                <w:rFonts w:ascii="BRH Malayalam Extra" w:hAnsi="BRH Malayalam Extra" w:cs="BRH Malayalam Extra"/>
-                <w:color w:val="000000"/>
-                <w:sz w:val="32"/>
-                <w:szCs w:val="32"/>
-                <w:lang w:val="it-IT"/>
+              </w:rPr>
+              <w:t>–</w:t>
+            </w:r>
+            <w:r>
+              <w:rPr>
+                <w:rFonts w:ascii="BRH Malayalam Extra" w:hAnsi="BRH Malayalam Extra" w:cs="BRH Malayalam Extra"/>
+                <w:color w:val="000000"/>
+                <w:sz w:val="32"/>
+                <w:szCs w:val="32"/>
               </w:rPr>
               <w:t xml:space="preserve"> ||</w:t>
             </w:r>
@@ -16657,7 +17513,6 @@
                 <w:rFonts w:cs="BRH Malayalam Extra"/>
                 <w:color w:val="FF0000"/>
                 <w:szCs w:val="40"/>
-                <w:lang w:val="it-IT"/>
               </w:rPr>
             </w:pPr>
             <w:r>
@@ -16666,7 +17521,6 @@
                 <w:color w:val="000000"/>
                 <w:sz w:val="32"/>
                 <w:szCs w:val="32"/>
-                <w:lang w:val="it-IT"/>
               </w:rPr>
               <w:t>A</w:t>
             </w:r>
@@ -16676,7 +17530,6 @@
                 <w:color w:val="000000"/>
                 <w:sz w:val="28"/>
                 <w:szCs w:val="32"/>
-                <w:lang w:val="it-IT"/>
               </w:rPr>
               <w:t>–</w:t>
             </w:r>
@@ -16687,7 +17540,6 @@
                 <w:sz w:val="32"/>
                 <w:szCs w:val="32"/>
                 <w:highlight w:val="green"/>
-                <w:lang w:val="it-IT"/>
               </w:rPr>
               <w:t>fþ¡ px</w:t>
             </w:r>
@@ -16697,7 +17549,6 @@
                 <w:color w:val="000000"/>
                 <w:sz w:val="32"/>
                 <w:szCs w:val="32"/>
-                <w:lang w:val="it-IT"/>
               </w:rPr>
               <w:t>— px</w:t>
             </w:r>
@@ -16707,17 +17558,15 @@
                 <w:color w:val="000000"/>
                 <w:sz w:val="28"/>
                 <w:szCs w:val="32"/>
-                <w:lang w:val="it-IT"/>
-              </w:rPr>
-              <w:t>–</w:t>
-            </w:r>
-            <w:r>
-              <w:rPr>
-                <w:rFonts w:ascii="BRH Malayalam Extra" w:hAnsi="BRH Malayalam Extra" w:cs="BRH Malayalam Extra"/>
-                <w:color w:val="000000"/>
-                <w:sz w:val="32"/>
-                <w:szCs w:val="32"/>
-                <w:lang w:val="it-IT"/>
+              </w:rPr>
+              <w:t>–</w:t>
+            </w:r>
+            <w:r>
+              <w:rPr>
+                <w:rFonts w:ascii="BRH Malayalam Extra" w:hAnsi="BRH Malayalam Extra" w:cs="BRH Malayalam Extra"/>
+                <w:color w:val="000000"/>
+                <w:sz w:val="32"/>
+                <w:szCs w:val="32"/>
               </w:rPr>
               <w:t xml:space="preserve"> „fþû</w:t>
             </w:r>
@@ -16728,7 +17577,6 @@
                 <w:sz w:val="32"/>
                 <w:szCs w:val="32"/>
                 <w:highlight w:val="green"/>
-                <w:lang w:val="it-IT"/>
               </w:rPr>
               <w:t>—f</w:t>
             </w:r>
@@ -16739,7 +17587,6 @@
                 <w:sz w:val="32"/>
                 <w:szCs w:val="32"/>
                 <w:highlight w:val="yellow"/>
-                <w:lang w:val="it-IT"/>
               </w:rPr>
               <w:t>þ</w:t>
             </w:r>
@@ -16750,7 +17597,6 @@
                 <w:sz w:val="32"/>
                 <w:szCs w:val="32"/>
                 <w:highlight w:val="green"/>
-                <w:lang w:val="it-IT"/>
               </w:rPr>
               <w:t>¡ px</w:t>
             </w:r>
@@ -16760,7 +17606,6 @@
                 <w:color w:val="000000"/>
                 <w:sz w:val="32"/>
                 <w:szCs w:val="32"/>
-                <w:lang w:val="it-IT"/>
               </w:rPr>
               <w:t xml:space="preserve"> jRöZ jRöZ px</w:t>
             </w:r>
@@ -16770,17 +17615,15 @@
                 <w:color w:val="000000"/>
                 <w:sz w:val="28"/>
                 <w:szCs w:val="32"/>
-                <w:lang w:val="it-IT"/>
-              </w:rPr>
-              <w:t>–</w:t>
-            </w:r>
-            <w:r>
-              <w:rPr>
-                <w:rFonts w:ascii="BRH Malayalam Extra" w:hAnsi="BRH Malayalam Extra" w:cs="BRH Malayalam Extra"/>
-                <w:color w:val="000000"/>
-                <w:sz w:val="32"/>
-                <w:szCs w:val="32"/>
-                <w:lang w:val="it-IT"/>
+              </w:rPr>
+              <w:t>–</w:t>
+            </w:r>
+            <w:r>
+              <w:rPr>
+                <w:rFonts w:ascii="BRH Malayalam Extra" w:hAnsi="BRH Malayalam Extra" w:cs="BRH Malayalam Extra"/>
+                <w:color w:val="000000"/>
+                <w:sz w:val="32"/>
+                <w:szCs w:val="32"/>
               </w:rPr>
               <w:t xml:space="preserve"> „fþû—</w:t>
             </w:r>
@@ -16791,7 +17634,6 @@
                 <w:sz w:val="32"/>
                 <w:szCs w:val="32"/>
                 <w:highlight w:val="green"/>
-                <w:lang w:val="it-IT"/>
               </w:rPr>
               <w:t>fþ</w:t>
             </w:r>
@@ -16802,7 +17644,6 @@
                 <w:sz w:val="32"/>
                 <w:szCs w:val="32"/>
                 <w:highlight w:val="yellow"/>
-                <w:lang w:val="it-IT"/>
               </w:rPr>
               <w:t>þ</w:t>
             </w:r>
@@ -16813,7 +17654,6 @@
                 <w:sz w:val="32"/>
                 <w:szCs w:val="32"/>
                 <w:highlight w:val="green"/>
-                <w:lang w:val="it-IT"/>
               </w:rPr>
               <w:t>¡ px</w:t>
             </w:r>
@@ -16823,7 +17663,6 @@
                 <w:color w:val="000000"/>
                 <w:sz w:val="32"/>
                 <w:szCs w:val="32"/>
-                <w:lang w:val="it-IT"/>
               </w:rPr>
               <w:t xml:space="preserve"> jRöZ | </w:t>
             </w:r>
@@ -16986,8 +17825,19 @@
                 <w:sz w:val="32"/>
                 <w:szCs w:val="32"/>
               </w:rPr>
-              <w:t>)-  by</w:t>
-            </w:r>
+              <w:t>)</w:t>
+            </w:r>
+            <w:proofErr w:type="gramStart"/>
+            <w:r>
+              <w:rPr>
+                <w:rFonts w:ascii="BRH Malayalam Extra" w:hAnsi="BRH Malayalam Extra" w:cs="BRH Malayalam Extra"/>
+                <w:color w:val="000000"/>
+                <w:sz w:val="32"/>
+                <w:szCs w:val="32"/>
+              </w:rPr>
+              <w:t>-  by</w:t>
+            </w:r>
+            <w:proofErr w:type="gramEnd"/>
             <w:r>
               <w:rPr>
                 <w:rFonts w:ascii="BRH Malayalam Extra" w:hAnsi="BRH Malayalam Extra" w:cs="BRH Malayalam Extra"/>
@@ -17229,8 +18079,19 @@
                 <w:sz w:val="32"/>
                 <w:szCs w:val="32"/>
               </w:rPr>
-              <w:t>)-  by</w:t>
-            </w:r>
+              <w:t>)</w:t>
+            </w:r>
+            <w:proofErr w:type="gramStart"/>
+            <w:r>
+              <w:rPr>
+                <w:rFonts w:ascii="BRH Malayalam Extra" w:hAnsi="BRH Malayalam Extra" w:cs="BRH Malayalam Extra"/>
+                <w:color w:val="000000"/>
+                <w:sz w:val="32"/>
+                <w:szCs w:val="32"/>
+              </w:rPr>
+              <w:t>-  by</w:t>
+            </w:r>
+            <w:proofErr w:type="gramEnd"/>
             <w:r>
               <w:rPr>
                 <w:rFonts w:ascii="BRH Malayalam Extra" w:hAnsi="BRH Malayalam Extra" w:cs="BRH Malayalam Extra"/>
@@ -17911,6 +18772,7 @@
                 <w:sz w:val="32"/>
                 <w:szCs w:val="32"/>
               </w:rPr>
+              <w:lastRenderedPageBreak/>
               <w:t>(</w:t>
             </w:r>
             <w:proofErr w:type="gramStart"/>
@@ -18032,7 +18894,27 @@
                 <w:sz w:val="32"/>
                 <w:szCs w:val="32"/>
               </w:rPr>
-              <w:t>)-  Aa— | q</w:t>
+              <w:t>)</w:t>
+            </w:r>
+            <w:proofErr w:type="gramStart"/>
+            <w:r>
+              <w:rPr>
+                <w:rFonts w:ascii="BRH Malayalam Extra" w:hAnsi="BRH Malayalam Extra" w:cs="BRH Malayalam Extra"/>
+                <w:color w:val="000000"/>
+                <w:sz w:val="32"/>
+                <w:szCs w:val="32"/>
+              </w:rPr>
+              <w:t>-  Aa</w:t>
+            </w:r>
+            <w:proofErr w:type="gramEnd"/>
+            <w:r>
+              <w:rPr>
+                <w:rFonts w:ascii="BRH Malayalam Extra" w:hAnsi="BRH Malayalam Extra" w:cs="BRH Malayalam Extra"/>
+                <w:color w:val="000000"/>
+                <w:sz w:val="32"/>
+                <w:szCs w:val="32"/>
+              </w:rPr>
+              <w:t>— | q</w:t>
             </w:r>
             <w:r>
               <w:rPr>
@@ -18543,8 +19425,19 @@
                 <w:sz w:val="32"/>
                 <w:szCs w:val="32"/>
               </w:rPr>
-              <w:t>)-  q</w:t>
-            </w:r>
+              <w:t>)</w:t>
+            </w:r>
+            <w:proofErr w:type="gramStart"/>
+            <w:r>
+              <w:rPr>
+                <w:rFonts w:ascii="BRH Malayalam Extra" w:hAnsi="BRH Malayalam Extra" w:cs="BRH Malayalam Extra"/>
+                <w:color w:val="000000"/>
+                <w:sz w:val="32"/>
+                <w:szCs w:val="32"/>
+              </w:rPr>
+              <w:t>-  q</w:t>
+            </w:r>
+            <w:proofErr w:type="gramEnd"/>
             <w:r>
               <w:rPr>
                 <w:rFonts w:ascii="BRH Malayalam Extra" w:hAnsi="BRH Malayalam Extra" w:cs="BRH Malayalam Extra"/>
@@ -18868,17 +19761,7 @@
                 <w:sz w:val="32"/>
                 <w:szCs w:val="32"/>
               </w:rPr>
-              <w:t xml:space="preserve">¥Zûx </w:t>
-            </w:r>
-            <w:r>
-              <w:rPr>
-                <w:rFonts w:ascii="BRH Malayalam Extra" w:hAnsi="BRH Malayalam Extra" w:cs="BRH Malayalam Extra"/>
-                <w:color w:val="000000"/>
-                <w:sz w:val="32"/>
-                <w:szCs w:val="32"/>
-              </w:rPr>
-              <w:lastRenderedPageBreak/>
-              <w:t>j¢</w:t>
+              <w:t>¥Zûx j¢</w:t>
             </w:r>
             <w:r>
               <w:rPr>
@@ -19247,8 +20130,19 @@
                 <w:sz w:val="32"/>
                 <w:szCs w:val="32"/>
               </w:rPr>
-              <w:t>)-  q</w:t>
-            </w:r>
+              <w:t>)</w:t>
+            </w:r>
+            <w:proofErr w:type="gramStart"/>
+            <w:r>
+              <w:rPr>
+                <w:rFonts w:ascii="BRH Malayalam Extra" w:hAnsi="BRH Malayalam Extra" w:cs="BRH Malayalam Extra"/>
+                <w:color w:val="000000"/>
+                <w:sz w:val="32"/>
+                <w:szCs w:val="32"/>
+              </w:rPr>
+              <w:t>-  q</w:t>
+            </w:r>
+            <w:proofErr w:type="gramEnd"/>
             <w:r>
               <w:rPr>
                 <w:rFonts w:ascii="BRH Malayalam Extra" w:hAnsi="BRH Malayalam Extra" w:cs="BRH Malayalam Extra"/>
@@ -19478,7 +20372,6 @@
                 <w:sz w:val="32"/>
                 <w:szCs w:val="32"/>
               </w:rPr>
-              <w:lastRenderedPageBreak/>
               <w:t>(</w:t>
             </w:r>
             <w:proofErr w:type="gramStart"/>
@@ -19600,7 +20493,27 @@
                 <w:sz w:val="32"/>
                 <w:szCs w:val="32"/>
               </w:rPr>
-              <w:t>)-  Aa— | q</w:t>
+              <w:t>)</w:t>
+            </w:r>
+            <w:proofErr w:type="gramStart"/>
+            <w:r>
+              <w:rPr>
+                <w:rFonts w:ascii="BRH Malayalam Extra" w:hAnsi="BRH Malayalam Extra" w:cs="BRH Malayalam Extra"/>
+                <w:color w:val="000000"/>
+                <w:sz w:val="32"/>
+                <w:szCs w:val="32"/>
+              </w:rPr>
+              <w:t>-  Aa</w:t>
+            </w:r>
+            <w:proofErr w:type="gramEnd"/>
+            <w:r>
+              <w:rPr>
+                <w:rFonts w:ascii="BRH Malayalam Extra" w:hAnsi="BRH Malayalam Extra" w:cs="BRH Malayalam Extra"/>
+                <w:color w:val="000000"/>
+                <w:sz w:val="32"/>
+                <w:szCs w:val="32"/>
+              </w:rPr>
+              <w:t>— | q</w:t>
             </w:r>
             <w:r>
               <w:rPr>
@@ -20094,8 +21007,19 @@
                 <w:sz w:val="32"/>
                 <w:szCs w:val="32"/>
               </w:rPr>
-              <w:t>)-  q</w:t>
-            </w:r>
+              <w:t>)</w:t>
+            </w:r>
+            <w:proofErr w:type="gramStart"/>
+            <w:r>
+              <w:rPr>
+                <w:rFonts w:ascii="BRH Malayalam Extra" w:hAnsi="BRH Malayalam Extra" w:cs="BRH Malayalam Extra"/>
+                <w:color w:val="000000"/>
+                <w:sz w:val="32"/>
+                <w:szCs w:val="32"/>
+              </w:rPr>
+              <w:t>-  q</w:t>
+            </w:r>
+            <w:proofErr w:type="gramEnd"/>
             <w:r>
               <w:rPr>
                 <w:rFonts w:ascii="BRH Malayalam Extra" w:hAnsi="BRH Malayalam Extra" w:cs="BRH Malayalam Extra"/>
@@ -20428,17 +21352,7 @@
                 <w:sz w:val="32"/>
                 <w:szCs w:val="32"/>
               </w:rPr>
-              <w:t xml:space="preserve">¥Zûx </w:t>
-            </w:r>
-            <w:r>
-              <w:rPr>
-                <w:rFonts w:ascii="BRH Malayalam Extra" w:hAnsi="BRH Malayalam Extra" w:cs="BRH Malayalam Extra"/>
-                <w:color w:val="000000"/>
-                <w:sz w:val="32"/>
-                <w:szCs w:val="32"/>
-              </w:rPr>
-              <w:lastRenderedPageBreak/>
-              <w:t>j¢</w:t>
+              <w:t>¥Zûx j¢</w:t>
             </w:r>
             <w:r>
               <w:rPr>
@@ -20789,8 +21703,19 @@
                 <w:sz w:val="32"/>
                 <w:szCs w:val="32"/>
               </w:rPr>
-              <w:t>)-  q</w:t>
-            </w:r>
+              <w:t>)</w:t>
+            </w:r>
+            <w:proofErr w:type="gramStart"/>
+            <w:r>
+              <w:rPr>
+                <w:rFonts w:ascii="BRH Malayalam Extra" w:hAnsi="BRH Malayalam Extra" w:cs="BRH Malayalam Extra"/>
+                <w:color w:val="000000"/>
+                <w:sz w:val="32"/>
+                <w:szCs w:val="32"/>
+              </w:rPr>
+              <w:t>-  q</w:t>
+            </w:r>
+            <w:proofErr w:type="gramEnd"/>
             <w:r>
               <w:rPr>
                 <w:rFonts w:ascii="BRH Malayalam Extra" w:hAnsi="BRH Malayalam Extra" w:cs="BRH Malayalam Extra"/>
@@ -21176,8 +22101,19 @@
                 <w:sz w:val="32"/>
                 <w:szCs w:val="32"/>
               </w:rPr>
-              <w:t>)-  A</w:t>
-            </w:r>
+              <w:t>)</w:t>
+            </w:r>
+            <w:proofErr w:type="gramStart"/>
+            <w:r>
+              <w:rPr>
+                <w:rFonts w:ascii="BRH Malayalam Extra" w:hAnsi="BRH Malayalam Extra" w:cs="BRH Malayalam Extra"/>
+                <w:color w:val="000000"/>
+                <w:sz w:val="32"/>
+                <w:szCs w:val="32"/>
+              </w:rPr>
+              <w:t>-  A</w:t>
+            </w:r>
+            <w:proofErr w:type="gramEnd"/>
             <w:r>
               <w:rPr>
                 <w:rFonts w:ascii="BRH Malayalam Extra" w:hAnsi="BRH Malayalam Extra" w:cs="BRH Malayalam Extra"/>
@@ -21903,8 +22839,19 @@
                 <w:sz w:val="32"/>
                 <w:szCs w:val="32"/>
               </w:rPr>
-              <w:t>)-  A</w:t>
-            </w:r>
+              <w:t>)</w:t>
+            </w:r>
+            <w:proofErr w:type="gramStart"/>
+            <w:r>
+              <w:rPr>
+                <w:rFonts w:ascii="BRH Malayalam Extra" w:hAnsi="BRH Malayalam Extra" w:cs="BRH Malayalam Extra"/>
+                <w:color w:val="000000"/>
+                <w:sz w:val="32"/>
+                <w:szCs w:val="32"/>
+              </w:rPr>
+              <w:t>-  A</w:t>
+            </w:r>
+            <w:proofErr w:type="gramEnd"/>
             <w:r>
               <w:rPr>
                 <w:rFonts w:ascii="BRH Malayalam Extra" w:hAnsi="BRH Malayalam Extra" w:cs="BRH Malayalam Extra"/>
@@ -24146,7 +25093,6 @@
                 <w:szCs w:val="32"/>
                 <w:lang w:val="it-IT"/>
               </w:rPr>
-              <w:lastRenderedPageBreak/>
               <w:t>(</w:t>
             </w:r>
             <w:r>
@@ -24715,6 +25661,7 @@
                 <w:szCs w:val="32"/>
                 <w:lang w:val="it-IT"/>
               </w:rPr>
+              <w:lastRenderedPageBreak/>
               <w:t>(</w:t>
             </w:r>
             <w:r>
@@ -28820,7 +29767,6 @@
                 <w:szCs w:val="32"/>
                 <w:lang w:val="it-IT"/>
               </w:rPr>
-              <w:lastRenderedPageBreak/>
               <w:t>(</w:t>
             </w:r>
             <w:r>
@@ -29145,7 +30091,17 @@
                 <w:sz w:val="32"/>
                 <w:szCs w:val="32"/>
               </w:rPr>
-              <w:t>J sLx</w:t>
+              <w:t xml:space="preserve">J </w:t>
+            </w:r>
+            <w:r>
+              <w:rPr>
+                <w:rFonts w:ascii="BRH Malayalam Extra" w:hAnsi="BRH Malayalam Extra" w:cs="BRH Malayalam Extra"/>
+                <w:color w:val="000000"/>
+                <w:sz w:val="32"/>
+                <w:szCs w:val="32"/>
+              </w:rPr>
+              <w:lastRenderedPageBreak/>
+              <w:t>sLx</w:t>
             </w:r>
             <w:r>
               <w:rPr>
@@ -29430,7 +30386,27 @@
                 <w:sz w:val="32"/>
                 <w:szCs w:val="32"/>
               </w:rPr>
-              <w:t>)-  h¡</w:t>
+              <w:t>)</w:t>
+            </w:r>
+            <w:proofErr w:type="gramStart"/>
+            <w:r>
+              <w:rPr>
+                <w:rFonts w:ascii="BRH Malayalam Extra" w:hAnsi="BRH Malayalam Extra" w:cs="BRH Malayalam Extra"/>
+                <w:color w:val="000000"/>
+                <w:sz w:val="32"/>
+                <w:szCs w:val="32"/>
+              </w:rPr>
+              <w:t>-  h</w:t>
+            </w:r>
+            <w:proofErr w:type="gramEnd"/>
+            <w:r>
+              <w:rPr>
+                <w:rFonts w:ascii="BRH Malayalam Extra" w:hAnsi="BRH Malayalam Extra" w:cs="BRH Malayalam Extra"/>
+                <w:color w:val="000000"/>
+                <w:sz w:val="32"/>
+                <w:szCs w:val="32"/>
+              </w:rPr>
+              <w:t>¡</w:t>
             </w:r>
             <w:r>
               <w:rPr>
@@ -29731,7 +30707,6 @@
                 <w:sz w:val="32"/>
                 <w:szCs w:val="32"/>
               </w:rPr>
-              <w:lastRenderedPageBreak/>
               <w:t>(</w:t>
             </w:r>
             <w:proofErr w:type="gramStart"/>
@@ -29853,7 +30828,27 @@
                 <w:sz w:val="32"/>
                 <w:szCs w:val="32"/>
               </w:rPr>
-              <w:t>)-  D¦</w:t>
+              <w:t>)</w:t>
+            </w:r>
+            <w:proofErr w:type="gramStart"/>
+            <w:r>
+              <w:rPr>
+                <w:rFonts w:ascii="BRH Malayalam Extra" w:hAnsi="BRH Malayalam Extra" w:cs="BRH Malayalam Extra"/>
+                <w:color w:val="000000"/>
+                <w:sz w:val="32"/>
+                <w:szCs w:val="32"/>
+              </w:rPr>
+              <w:t>-  D</w:t>
+            </w:r>
+            <w:proofErr w:type="gramEnd"/>
+            <w:r>
+              <w:rPr>
+                <w:rFonts w:ascii="BRH Malayalam Extra" w:hAnsi="BRH Malayalam Extra" w:cs="BRH Malayalam Extra"/>
+                <w:color w:val="000000"/>
+                <w:sz w:val="32"/>
+                <w:szCs w:val="32"/>
+              </w:rPr>
+              <w:t>¦</w:t>
             </w:r>
             <w:r>
               <w:rPr>
@@ -30051,7 +31046,17 @@
                 <w:sz w:val="32"/>
                 <w:szCs w:val="32"/>
               </w:rPr>
-              <w:t>J sLx</w:t>
+              <w:t xml:space="preserve">J </w:t>
+            </w:r>
+            <w:r>
+              <w:rPr>
+                <w:rFonts w:ascii="BRH Malayalam Extra" w:hAnsi="BRH Malayalam Extra" w:cs="BRH Malayalam Extra"/>
+                <w:color w:val="000000"/>
+                <w:sz w:val="32"/>
+                <w:szCs w:val="32"/>
+              </w:rPr>
+              <w:lastRenderedPageBreak/>
+              <w:t>sLx</w:t>
             </w:r>
             <w:r>
               <w:rPr>
@@ -30739,7 +31744,7 @@
 </file>
 
 <file path=word/endnotes.xml><?xml version="1.0" encoding="utf-8"?>
-<w:endnotes xmlns:wpc="http://schemas.microsoft.com/office/word/2010/wordprocessingCanvas" xmlns:cx="http://schemas.microsoft.com/office/drawing/2014/chartex" xmlns:cx1="http://schemas.microsoft.com/office/drawing/2015/9/8/chartex" xmlns:cx2="http://schemas.microsoft.com/office/drawing/2015/10/21/chartex" xmlns:cx3="http://schemas.microsoft.com/office/drawing/2016/5/9/chartex" xmlns:cx4="http://schemas.microsoft.com/office/drawing/2016/5/10/chartex" xmlns:cx5="http://schemas.microsoft.com/office/drawing/2016/5/11/chartex" xmlns:cx6="http://schemas.microsoft.com/office/drawing/2016/5/12/chartex" xmlns:cx7="http://schemas.microsoft.com/office/drawing/2016/5/13/chartex" xmlns:cx8="http://schemas.microsoft.com/office/drawing/2016/5/14/chartex" xmlns:mc="http://schemas.openxmlformats.org/markup-compatibility/2006" xmlns:aink="http://schemas.microsoft.com/office/drawing/2016/ink" xmlns:am3d="http://schemas.microsoft.com/office/drawing/2017/model3d" xmlns:o="urn:schemas-microsoft-com:office:office" xmlns:oel="http://schemas.microsoft.com/office/2019/extlst" xmlns:r="http://schemas.openxmlformats.org/officeDocument/2006/relationships" xmlns:m="http://schemas.openxmlformats.org/officeDocument/2006/math" xmlns:v="urn:schemas-microsoft-com:vml" xmlns:wp14="http://schemas.microsoft.com/office/word/2010/wordprocessingDrawing" xmlns:wp="http://schemas.openxmlformats.org/drawingml/2006/wordprocessingDrawing" xmlns:w10="urn:schemas-microsoft-com:office:word" xmlns:w="http://schemas.openxmlformats.org/wordprocessingml/2006/main" xmlns:w14="http://schemas.microsoft.com/office/word/2010/wordml" xmlns:w15="http://schemas.microsoft.com/office/word/2012/wordml" xmlns:w16cex="http://schemas.microsoft.com/office/word/2018/wordml/cex" xmlns:w16cid="http://schemas.microsoft.com/office/word/2016/wordml/cid" xmlns:w16="http://schemas.microsoft.com/office/word/2018/wordml" xmlns:w16sdtdh="http://schemas.microsoft.com/office/word/2020/wordml/sdtdatahash" xmlns:w16se="http://schemas.microsoft.com/office/word/2015/wordml/symex" xmlns:wpg="http://schemas.microsoft.com/office/word/2010/wordprocessingGroup" xmlns:wpi="http://schemas.microsoft.com/office/word/2010/wordprocessingInk" xmlns:wne="http://schemas.microsoft.com/office/word/2006/wordml" xmlns:wps="http://schemas.microsoft.com/office/word/2010/wordprocessingShape" mc:Ignorable="w14 w15 w16se w16cid w16 w16cex w16sdtdh wp14">
+<w:endnotes xmlns:wpc="http://schemas.microsoft.com/office/word/2010/wordprocessingCanvas" xmlns:cx="http://schemas.microsoft.com/office/drawing/2014/chartex" xmlns:cx1="http://schemas.microsoft.com/office/drawing/2015/9/8/chartex" xmlns:cx2="http://schemas.microsoft.com/office/drawing/2015/10/21/chartex" xmlns:cx3="http://schemas.microsoft.com/office/drawing/2016/5/9/chartex" xmlns:cx4="http://schemas.microsoft.com/office/drawing/2016/5/10/chartex" xmlns:cx5="http://schemas.microsoft.com/office/drawing/2016/5/11/chartex" xmlns:cx6="http://schemas.microsoft.com/office/drawing/2016/5/12/chartex" xmlns:cx7="http://schemas.microsoft.com/office/drawing/2016/5/13/chartex" xmlns:cx8="http://schemas.microsoft.com/office/drawing/2016/5/14/chartex" xmlns:mc="http://schemas.openxmlformats.org/markup-compatibility/2006" xmlns:aink="http://schemas.microsoft.com/office/drawing/2016/ink" xmlns:am3d="http://schemas.microsoft.com/office/drawing/2017/model3d" xmlns:o="urn:schemas-microsoft-com:office:office" xmlns:oel="http://schemas.microsoft.com/office/2019/extlst" xmlns:r="http://schemas.openxmlformats.org/officeDocument/2006/relationships" xmlns:m="http://schemas.openxmlformats.org/officeDocument/2006/math" xmlns:v="urn:schemas-microsoft-com:vml" xmlns:wp14="http://schemas.microsoft.com/office/word/2010/wordprocessingDrawing" xmlns:wp="http://schemas.openxmlformats.org/drawingml/2006/wordprocessingDrawing" xmlns:w10="urn:schemas-microsoft-com:office:word" xmlns:w="http://schemas.openxmlformats.org/wordprocessingml/2006/main" xmlns:w14="http://schemas.microsoft.com/office/word/2010/wordml" xmlns:w15="http://schemas.microsoft.com/office/word/2012/wordml" xmlns:w16cex="http://schemas.microsoft.com/office/word/2018/wordml/cex" xmlns:w16cid="http://schemas.microsoft.com/office/word/2016/wordml/cid" xmlns:w16="http://schemas.microsoft.com/office/word/2018/wordml" xmlns:w16du="http://schemas.microsoft.com/office/word/2023/wordml/word16du" xmlns:w16sdtdh="http://schemas.microsoft.com/office/word/2020/wordml/sdtdatahash" xmlns:w16sdtfl="http://schemas.microsoft.com/office/word/2024/wordml/sdtformatlock" xmlns:w16se="http://schemas.microsoft.com/office/word/2015/wordml/symex" xmlns:wpg="http://schemas.microsoft.com/office/word/2010/wordprocessingGroup" xmlns:wpi="http://schemas.microsoft.com/office/word/2010/wordprocessingInk" xmlns:wne="http://schemas.microsoft.com/office/word/2006/wordml" xmlns:wps="http://schemas.microsoft.com/office/word/2010/wordprocessingShape" mc:Ignorable="w14 w15 w16se w16cid w16 w16cex w16sdtdh w16sdtfl w16du wp14">
   <w:endnote w:type="separator" w:id="-1">
     <w:p>
       <w:pPr>
@@ -30764,7 +31769,7 @@
 </file>
 
 <file path=word/footer1.xml><?xml version="1.0" encoding="utf-8"?>
-<w:ftr xmlns:wpc="http://schemas.microsoft.com/office/word/2010/wordprocessingCanvas" xmlns:cx="http://schemas.microsoft.com/office/drawing/2014/chartex" xmlns:cx1="http://schemas.microsoft.com/office/drawing/2015/9/8/chartex" xmlns:cx2="http://schemas.microsoft.com/office/drawing/2015/10/21/chartex" xmlns:cx3="http://schemas.microsoft.com/office/drawing/2016/5/9/chartex" xmlns:cx4="http://schemas.microsoft.com/office/drawing/2016/5/10/chartex" xmlns:cx5="http://schemas.microsoft.com/office/drawing/2016/5/11/chartex" xmlns:cx6="http://schemas.microsoft.com/office/drawing/2016/5/12/chartex" xmlns:cx7="http://schemas.microsoft.com/office/drawing/2016/5/13/chartex" xmlns:cx8="http://schemas.microsoft.com/office/drawing/2016/5/14/chartex" xmlns:mc="http://schemas.openxmlformats.org/markup-compatibility/2006" xmlns:aink="http://schemas.microsoft.com/office/drawing/2016/ink" xmlns:am3d="http://schemas.microsoft.com/office/drawing/2017/model3d" xmlns:o="urn:schemas-microsoft-com:office:office" xmlns:oel="http://schemas.microsoft.com/office/2019/extlst" xmlns:r="http://schemas.openxmlformats.org/officeDocument/2006/relationships" xmlns:m="http://schemas.openxmlformats.org/officeDocument/2006/math" xmlns:v="urn:schemas-microsoft-com:vml" xmlns:wp14="http://schemas.microsoft.com/office/word/2010/wordprocessingDrawing" xmlns:wp="http://schemas.openxmlformats.org/drawingml/2006/wordprocessingDrawing" xmlns:w10="urn:schemas-microsoft-com:office:word" xmlns:w="http://schemas.openxmlformats.org/wordprocessingml/2006/main" xmlns:w14="http://schemas.microsoft.com/office/word/2010/wordml" xmlns:w15="http://schemas.microsoft.com/office/word/2012/wordml" xmlns:w16cex="http://schemas.microsoft.com/office/word/2018/wordml/cex" xmlns:w16cid="http://schemas.microsoft.com/office/word/2016/wordml/cid" xmlns:w16="http://schemas.microsoft.com/office/word/2018/wordml" xmlns:w16sdtdh="http://schemas.microsoft.com/office/word/2020/wordml/sdtdatahash" xmlns:w16se="http://schemas.microsoft.com/office/word/2015/wordml/symex" xmlns:wpg="http://schemas.microsoft.com/office/word/2010/wordprocessingGroup" xmlns:wpi="http://schemas.microsoft.com/office/word/2010/wordprocessingInk" xmlns:wne="http://schemas.microsoft.com/office/word/2006/wordml" xmlns:wps="http://schemas.microsoft.com/office/word/2010/wordprocessingShape" mc:Ignorable="w14 w15 w16se w16cid w16 w16cex w16sdtdh wp14">
+<w:ftr xmlns:wpc="http://schemas.microsoft.com/office/word/2010/wordprocessingCanvas" xmlns:cx="http://schemas.microsoft.com/office/drawing/2014/chartex" xmlns:cx1="http://schemas.microsoft.com/office/drawing/2015/9/8/chartex" xmlns:cx2="http://schemas.microsoft.com/office/drawing/2015/10/21/chartex" xmlns:cx3="http://schemas.microsoft.com/office/drawing/2016/5/9/chartex" xmlns:cx4="http://schemas.microsoft.com/office/drawing/2016/5/10/chartex" xmlns:cx5="http://schemas.microsoft.com/office/drawing/2016/5/11/chartex" xmlns:cx6="http://schemas.microsoft.com/office/drawing/2016/5/12/chartex" xmlns:cx7="http://schemas.microsoft.com/office/drawing/2016/5/13/chartex" xmlns:cx8="http://schemas.microsoft.com/office/drawing/2016/5/14/chartex" xmlns:mc="http://schemas.openxmlformats.org/markup-compatibility/2006" xmlns:aink="http://schemas.microsoft.com/office/drawing/2016/ink" xmlns:am3d="http://schemas.microsoft.com/office/drawing/2017/model3d" xmlns:o="urn:schemas-microsoft-com:office:office" xmlns:oel="http://schemas.microsoft.com/office/2019/extlst" xmlns:r="http://schemas.openxmlformats.org/officeDocument/2006/relationships" xmlns:m="http://schemas.openxmlformats.org/officeDocument/2006/math" xmlns:v="urn:schemas-microsoft-com:vml" xmlns:wp14="http://schemas.microsoft.com/office/word/2010/wordprocessingDrawing" xmlns:wp="http://schemas.openxmlformats.org/drawingml/2006/wordprocessingDrawing" xmlns:w10="urn:schemas-microsoft-com:office:word" xmlns:w="http://schemas.openxmlformats.org/wordprocessingml/2006/main" xmlns:w14="http://schemas.microsoft.com/office/word/2010/wordml" xmlns:w15="http://schemas.microsoft.com/office/word/2012/wordml" xmlns:w16cex="http://schemas.microsoft.com/office/word/2018/wordml/cex" xmlns:w16cid="http://schemas.microsoft.com/office/word/2016/wordml/cid" xmlns:w16="http://schemas.microsoft.com/office/word/2018/wordml" xmlns:w16du="http://schemas.microsoft.com/office/word/2023/wordml/word16du" xmlns:w16sdtdh="http://schemas.microsoft.com/office/word/2020/wordml/sdtdatahash" xmlns:w16sdtfl="http://schemas.microsoft.com/office/word/2024/wordml/sdtformatlock" xmlns:w16se="http://schemas.microsoft.com/office/word/2015/wordml/symex" xmlns:wpg="http://schemas.microsoft.com/office/word/2010/wordprocessingGroup" xmlns:wpi="http://schemas.microsoft.com/office/word/2010/wordprocessingInk" xmlns:wne="http://schemas.microsoft.com/office/word/2006/wordml" xmlns:wps="http://schemas.microsoft.com/office/word/2010/wordprocessingShape" mc:Ignorable="w14 w15 w16se w16cid w16 w16cex w16sdtdh w16sdtfl w16du wp14">
   <w:p>
     <w:pPr>
       <w:pBdr>
@@ -30946,7 +31951,7 @@
 </file>
 
 <file path=word/footer2.xml><?xml version="1.0" encoding="utf-8"?>
-<w:ftr xmlns:wpc="http://schemas.microsoft.com/office/word/2010/wordprocessingCanvas" xmlns:cx="http://schemas.microsoft.com/office/drawing/2014/chartex" xmlns:cx1="http://schemas.microsoft.com/office/drawing/2015/9/8/chartex" xmlns:cx2="http://schemas.microsoft.com/office/drawing/2015/10/21/chartex" xmlns:cx3="http://schemas.microsoft.com/office/drawing/2016/5/9/chartex" xmlns:cx4="http://schemas.microsoft.com/office/drawing/2016/5/10/chartex" xmlns:cx5="http://schemas.microsoft.com/office/drawing/2016/5/11/chartex" xmlns:cx6="http://schemas.microsoft.com/office/drawing/2016/5/12/chartex" xmlns:cx7="http://schemas.microsoft.com/office/drawing/2016/5/13/chartex" xmlns:cx8="http://schemas.microsoft.com/office/drawing/2016/5/14/chartex" xmlns:mc="http://schemas.openxmlformats.org/markup-compatibility/2006" xmlns:aink="http://schemas.microsoft.com/office/drawing/2016/ink" xmlns:am3d="http://schemas.microsoft.com/office/drawing/2017/model3d" xmlns:o="urn:schemas-microsoft-com:office:office" xmlns:oel="http://schemas.microsoft.com/office/2019/extlst" xmlns:r="http://schemas.openxmlformats.org/officeDocument/2006/relationships" xmlns:m="http://schemas.openxmlformats.org/officeDocument/2006/math" xmlns:v="urn:schemas-microsoft-com:vml" xmlns:wp14="http://schemas.microsoft.com/office/word/2010/wordprocessingDrawing" xmlns:wp="http://schemas.openxmlformats.org/drawingml/2006/wordprocessingDrawing" xmlns:w10="urn:schemas-microsoft-com:office:word" xmlns:w="http://schemas.openxmlformats.org/wordprocessingml/2006/main" xmlns:w14="http://schemas.microsoft.com/office/word/2010/wordml" xmlns:w15="http://schemas.microsoft.com/office/word/2012/wordml" xmlns:w16cex="http://schemas.microsoft.com/office/word/2018/wordml/cex" xmlns:w16cid="http://schemas.microsoft.com/office/word/2016/wordml/cid" xmlns:w16="http://schemas.microsoft.com/office/word/2018/wordml" xmlns:w16sdtdh="http://schemas.microsoft.com/office/word/2020/wordml/sdtdatahash" xmlns:w16se="http://schemas.microsoft.com/office/word/2015/wordml/symex" xmlns:wpg="http://schemas.microsoft.com/office/word/2010/wordprocessingGroup" xmlns:wpi="http://schemas.microsoft.com/office/word/2010/wordprocessingInk" xmlns:wne="http://schemas.microsoft.com/office/word/2006/wordml" xmlns:wps="http://schemas.microsoft.com/office/word/2010/wordprocessingShape" mc:Ignorable="w14 w15 w16se w16cid w16 w16cex w16sdtdh wp14">
+<w:ftr xmlns:wpc="http://schemas.microsoft.com/office/word/2010/wordprocessingCanvas" xmlns:cx="http://schemas.microsoft.com/office/drawing/2014/chartex" xmlns:cx1="http://schemas.microsoft.com/office/drawing/2015/9/8/chartex" xmlns:cx2="http://schemas.microsoft.com/office/drawing/2015/10/21/chartex" xmlns:cx3="http://schemas.microsoft.com/office/drawing/2016/5/9/chartex" xmlns:cx4="http://schemas.microsoft.com/office/drawing/2016/5/10/chartex" xmlns:cx5="http://schemas.microsoft.com/office/drawing/2016/5/11/chartex" xmlns:cx6="http://schemas.microsoft.com/office/drawing/2016/5/12/chartex" xmlns:cx7="http://schemas.microsoft.com/office/drawing/2016/5/13/chartex" xmlns:cx8="http://schemas.microsoft.com/office/drawing/2016/5/14/chartex" xmlns:mc="http://schemas.openxmlformats.org/markup-compatibility/2006" xmlns:aink="http://schemas.microsoft.com/office/drawing/2016/ink" xmlns:am3d="http://schemas.microsoft.com/office/drawing/2017/model3d" xmlns:o="urn:schemas-microsoft-com:office:office" xmlns:oel="http://schemas.microsoft.com/office/2019/extlst" xmlns:r="http://schemas.openxmlformats.org/officeDocument/2006/relationships" xmlns:m="http://schemas.openxmlformats.org/officeDocument/2006/math" xmlns:v="urn:schemas-microsoft-com:vml" xmlns:wp14="http://schemas.microsoft.com/office/word/2010/wordprocessingDrawing" xmlns:wp="http://schemas.openxmlformats.org/drawingml/2006/wordprocessingDrawing" xmlns:w10="urn:schemas-microsoft-com:office:word" xmlns:w="http://schemas.openxmlformats.org/wordprocessingml/2006/main" xmlns:w14="http://schemas.microsoft.com/office/word/2010/wordml" xmlns:w15="http://schemas.microsoft.com/office/word/2012/wordml" xmlns:w16cex="http://schemas.microsoft.com/office/word/2018/wordml/cex" xmlns:w16cid="http://schemas.microsoft.com/office/word/2016/wordml/cid" xmlns:w16="http://schemas.microsoft.com/office/word/2018/wordml" xmlns:w16du="http://schemas.microsoft.com/office/word/2023/wordml/word16du" xmlns:w16sdtdh="http://schemas.microsoft.com/office/word/2020/wordml/sdtdatahash" xmlns:w16sdtfl="http://schemas.microsoft.com/office/word/2024/wordml/sdtformatlock" xmlns:w16se="http://schemas.microsoft.com/office/word/2015/wordml/symex" xmlns:wpg="http://schemas.microsoft.com/office/word/2010/wordprocessingGroup" xmlns:wpi="http://schemas.microsoft.com/office/word/2010/wordprocessingInk" xmlns:wne="http://schemas.microsoft.com/office/word/2006/wordml" xmlns:wps="http://schemas.microsoft.com/office/word/2010/wordprocessingShape" mc:Ignorable="w14 w15 w16se w16cid w16 w16cex w16sdtdh w16sdtfl w16du wp14">
   <w:p>
     <w:pPr>
       <w:pBdr>
@@ -31152,7 +32157,7 @@
 </file>
 
 <file path=word/footnotes.xml><?xml version="1.0" encoding="utf-8"?>
-<w:footnotes xmlns:wpc="http://schemas.microsoft.com/office/word/2010/wordprocessingCanvas" xmlns:cx="http://schemas.microsoft.com/office/drawing/2014/chartex" xmlns:cx1="http://schemas.microsoft.com/office/drawing/2015/9/8/chartex" xmlns:cx2="http://schemas.microsoft.com/office/drawing/2015/10/21/chartex" xmlns:cx3="http://schemas.microsoft.com/office/drawing/2016/5/9/chartex" xmlns:cx4="http://schemas.microsoft.com/office/drawing/2016/5/10/chartex" xmlns:cx5="http://schemas.microsoft.com/office/drawing/2016/5/11/chartex" xmlns:cx6="http://schemas.microsoft.com/office/drawing/2016/5/12/chartex" xmlns:cx7="http://schemas.microsoft.com/office/drawing/2016/5/13/chartex" xmlns:cx8="http://schemas.microsoft.com/office/drawing/2016/5/14/chartex" xmlns:mc="http://schemas.openxmlformats.org/markup-compatibility/2006" xmlns:aink="http://schemas.microsoft.com/office/drawing/2016/ink" xmlns:am3d="http://schemas.microsoft.com/office/drawing/2017/model3d" xmlns:o="urn:schemas-microsoft-com:office:office" xmlns:oel="http://schemas.microsoft.com/office/2019/extlst" xmlns:r="http://schemas.openxmlformats.org/officeDocument/2006/relationships" xmlns:m="http://schemas.openxmlformats.org/officeDocument/2006/math" xmlns:v="urn:schemas-microsoft-com:vml" xmlns:wp14="http://schemas.microsoft.com/office/word/2010/wordprocessingDrawing" xmlns:wp="http://schemas.openxmlformats.org/drawingml/2006/wordprocessingDrawing" xmlns:w10="urn:schemas-microsoft-com:office:word" xmlns:w="http://schemas.openxmlformats.org/wordprocessingml/2006/main" xmlns:w14="http://schemas.microsoft.com/office/word/2010/wordml" xmlns:w15="http://schemas.microsoft.com/office/word/2012/wordml" xmlns:w16cex="http://schemas.microsoft.com/office/word/2018/wordml/cex" xmlns:w16cid="http://schemas.microsoft.com/office/word/2016/wordml/cid" xmlns:w16="http://schemas.microsoft.com/office/word/2018/wordml" xmlns:w16sdtdh="http://schemas.microsoft.com/office/word/2020/wordml/sdtdatahash" xmlns:w16se="http://schemas.microsoft.com/office/word/2015/wordml/symex" xmlns:wpg="http://schemas.microsoft.com/office/word/2010/wordprocessingGroup" xmlns:wpi="http://schemas.microsoft.com/office/word/2010/wordprocessingInk" xmlns:wne="http://schemas.microsoft.com/office/word/2006/wordml" xmlns:wps="http://schemas.microsoft.com/office/word/2010/wordprocessingShape" mc:Ignorable="w14 w15 w16se w16cid w16 w16cex w16sdtdh wp14">
+<w:footnotes xmlns:wpc="http://schemas.microsoft.com/office/word/2010/wordprocessingCanvas" xmlns:cx="http://schemas.microsoft.com/office/drawing/2014/chartex" xmlns:cx1="http://schemas.microsoft.com/office/drawing/2015/9/8/chartex" xmlns:cx2="http://schemas.microsoft.com/office/drawing/2015/10/21/chartex" xmlns:cx3="http://schemas.microsoft.com/office/drawing/2016/5/9/chartex" xmlns:cx4="http://schemas.microsoft.com/office/drawing/2016/5/10/chartex" xmlns:cx5="http://schemas.microsoft.com/office/drawing/2016/5/11/chartex" xmlns:cx6="http://schemas.microsoft.com/office/drawing/2016/5/12/chartex" xmlns:cx7="http://schemas.microsoft.com/office/drawing/2016/5/13/chartex" xmlns:cx8="http://schemas.microsoft.com/office/drawing/2016/5/14/chartex" xmlns:mc="http://schemas.openxmlformats.org/markup-compatibility/2006" xmlns:aink="http://schemas.microsoft.com/office/drawing/2016/ink" xmlns:am3d="http://schemas.microsoft.com/office/drawing/2017/model3d" xmlns:o="urn:schemas-microsoft-com:office:office" xmlns:oel="http://schemas.microsoft.com/office/2019/extlst" xmlns:r="http://schemas.openxmlformats.org/officeDocument/2006/relationships" xmlns:m="http://schemas.openxmlformats.org/officeDocument/2006/math" xmlns:v="urn:schemas-microsoft-com:vml" xmlns:wp14="http://schemas.microsoft.com/office/word/2010/wordprocessingDrawing" xmlns:wp="http://schemas.openxmlformats.org/drawingml/2006/wordprocessingDrawing" xmlns:w10="urn:schemas-microsoft-com:office:word" xmlns:w="http://schemas.openxmlformats.org/wordprocessingml/2006/main" xmlns:w14="http://schemas.microsoft.com/office/word/2010/wordml" xmlns:w15="http://schemas.microsoft.com/office/word/2012/wordml" xmlns:w16cex="http://schemas.microsoft.com/office/word/2018/wordml/cex" xmlns:w16cid="http://schemas.microsoft.com/office/word/2016/wordml/cid" xmlns:w16="http://schemas.microsoft.com/office/word/2018/wordml" xmlns:w16du="http://schemas.microsoft.com/office/word/2023/wordml/word16du" xmlns:w16sdtdh="http://schemas.microsoft.com/office/word/2020/wordml/sdtdatahash" xmlns:w16sdtfl="http://schemas.microsoft.com/office/word/2024/wordml/sdtformatlock" xmlns:w16se="http://schemas.microsoft.com/office/word/2015/wordml/symex" xmlns:wpg="http://schemas.microsoft.com/office/word/2010/wordprocessingGroup" xmlns:wpi="http://schemas.microsoft.com/office/word/2010/wordprocessingInk" xmlns:wne="http://schemas.microsoft.com/office/word/2006/wordml" xmlns:wps="http://schemas.microsoft.com/office/word/2010/wordprocessingShape" mc:Ignorable="w14 w15 w16se w16cid w16 w16cex w16sdtdh w16sdtfl w16du wp14">
   <w:footnote w:type="separator" w:id="-1">
     <w:p>
       <w:pPr>
@@ -31177,7 +32182,7 @@
 </file>
 
 <file path=word/header1.xml><?xml version="1.0" encoding="utf-8"?>
-<w:hdr xmlns:wpc="http://schemas.microsoft.com/office/word/2010/wordprocessingCanvas" xmlns:cx="http://schemas.microsoft.com/office/drawing/2014/chartex" xmlns:cx1="http://schemas.microsoft.com/office/drawing/2015/9/8/chartex" xmlns:cx2="http://schemas.microsoft.com/office/drawing/2015/10/21/chartex" xmlns:cx3="http://schemas.microsoft.com/office/drawing/2016/5/9/chartex" xmlns:cx4="http://schemas.microsoft.com/office/drawing/2016/5/10/chartex" xmlns:cx5="http://schemas.microsoft.com/office/drawing/2016/5/11/chartex" xmlns:cx6="http://schemas.microsoft.com/office/drawing/2016/5/12/chartex" xmlns:cx7="http://schemas.microsoft.com/office/drawing/2016/5/13/chartex" xmlns:cx8="http://schemas.microsoft.com/office/drawing/2016/5/14/chartex" xmlns:mc="http://schemas.openxmlformats.org/markup-compatibility/2006" xmlns:aink="http://schemas.microsoft.com/office/drawing/2016/ink" xmlns:am3d="http://schemas.microsoft.com/office/drawing/2017/model3d" xmlns:o="urn:schemas-microsoft-com:office:office" xmlns:oel="http://schemas.microsoft.com/office/2019/extlst" xmlns:r="http://schemas.openxmlformats.org/officeDocument/2006/relationships" xmlns:m="http://schemas.openxmlformats.org/officeDocument/2006/math" xmlns:v="urn:schemas-microsoft-com:vml" xmlns:wp14="http://schemas.microsoft.com/office/word/2010/wordprocessingDrawing" xmlns:wp="http://schemas.openxmlformats.org/drawingml/2006/wordprocessingDrawing" xmlns:w10="urn:schemas-microsoft-com:office:word" xmlns:w="http://schemas.openxmlformats.org/wordprocessingml/2006/main" xmlns:w14="http://schemas.microsoft.com/office/word/2010/wordml" xmlns:w15="http://schemas.microsoft.com/office/word/2012/wordml" xmlns:w16cex="http://schemas.microsoft.com/office/word/2018/wordml/cex" xmlns:w16cid="http://schemas.microsoft.com/office/word/2016/wordml/cid" xmlns:w16="http://schemas.microsoft.com/office/word/2018/wordml" xmlns:w16sdtdh="http://schemas.microsoft.com/office/word/2020/wordml/sdtdatahash" xmlns:w16se="http://schemas.microsoft.com/office/word/2015/wordml/symex" xmlns:wpg="http://schemas.microsoft.com/office/word/2010/wordprocessingGroup" xmlns:wpi="http://schemas.microsoft.com/office/word/2010/wordprocessingInk" xmlns:wne="http://schemas.microsoft.com/office/word/2006/wordml" xmlns:wps="http://schemas.microsoft.com/office/word/2010/wordprocessingShape" mc:Ignorable="w14 w15 w16se w16cid w16 w16cex w16sdtdh wp14">
+<w:hdr xmlns:wpc="http://schemas.microsoft.com/office/word/2010/wordprocessingCanvas" xmlns:cx="http://schemas.microsoft.com/office/drawing/2014/chartex" xmlns:cx1="http://schemas.microsoft.com/office/drawing/2015/9/8/chartex" xmlns:cx2="http://schemas.microsoft.com/office/drawing/2015/10/21/chartex" xmlns:cx3="http://schemas.microsoft.com/office/drawing/2016/5/9/chartex" xmlns:cx4="http://schemas.microsoft.com/office/drawing/2016/5/10/chartex" xmlns:cx5="http://schemas.microsoft.com/office/drawing/2016/5/11/chartex" xmlns:cx6="http://schemas.microsoft.com/office/drawing/2016/5/12/chartex" xmlns:cx7="http://schemas.microsoft.com/office/drawing/2016/5/13/chartex" xmlns:cx8="http://schemas.microsoft.com/office/drawing/2016/5/14/chartex" xmlns:mc="http://schemas.openxmlformats.org/markup-compatibility/2006" xmlns:aink="http://schemas.microsoft.com/office/drawing/2016/ink" xmlns:am3d="http://schemas.microsoft.com/office/drawing/2017/model3d" xmlns:o="urn:schemas-microsoft-com:office:office" xmlns:oel="http://schemas.microsoft.com/office/2019/extlst" xmlns:r="http://schemas.openxmlformats.org/officeDocument/2006/relationships" xmlns:m="http://schemas.openxmlformats.org/officeDocument/2006/math" xmlns:v="urn:schemas-microsoft-com:vml" xmlns:wp14="http://schemas.microsoft.com/office/word/2010/wordprocessingDrawing" xmlns:wp="http://schemas.openxmlformats.org/drawingml/2006/wordprocessingDrawing" xmlns:w10="urn:schemas-microsoft-com:office:word" xmlns:w="http://schemas.openxmlformats.org/wordprocessingml/2006/main" xmlns:w14="http://schemas.microsoft.com/office/word/2010/wordml" xmlns:w15="http://schemas.microsoft.com/office/word/2012/wordml" xmlns:w16cex="http://schemas.microsoft.com/office/word/2018/wordml/cex" xmlns:w16cid="http://schemas.microsoft.com/office/word/2016/wordml/cid" xmlns:w16="http://schemas.microsoft.com/office/word/2018/wordml" xmlns:w16du="http://schemas.microsoft.com/office/word/2023/wordml/word16du" xmlns:w16sdtdh="http://schemas.microsoft.com/office/word/2020/wordml/sdtdatahash" xmlns:w16sdtfl="http://schemas.microsoft.com/office/word/2024/wordml/sdtformatlock" xmlns:w16se="http://schemas.microsoft.com/office/word/2015/wordml/symex" xmlns:wpg="http://schemas.microsoft.com/office/word/2010/wordprocessingGroup" xmlns:wpi="http://schemas.microsoft.com/office/word/2010/wordprocessingInk" xmlns:wne="http://schemas.microsoft.com/office/word/2006/wordml" xmlns:wps="http://schemas.microsoft.com/office/word/2010/wordprocessingShape" mc:Ignorable="w14 w15 w16se w16cid w16 w16cex w16sdtdh w16sdtfl w16du wp14">
   <w:p>
     <w:pPr>
       <w:pStyle w:val="Header"/>
@@ -31198,7 +32203,7 @@
 </file>
 
 <file path=word/header2.xml><?xml version="1.0" encoding="utf-8"?>
-<w:hdr xmlns:wpc="http://schemas.microsoft.com/office/word/2010/wordprocessingCanvas" xmlns:cx="http://schemas.microsoft.com/office/drawing/2014/chartex" xmlns:cx1="http://schemas.microsoft.com/office/drawing/2015/9/8/chartex" xmlns:cx2="http://schemas.microsoft.com/office/drawing/2015/10/21/chartex" xmlns:cx3="http://schemas.microsoft.com/office/drawing/2016/5/9/chartex" xmlns:cx4="http://schemas.microsoft.com/office/drawing/2016/5/10/chartex" xmlns:cx5="http://schemas.microsoft.com/office/drawing/2016/5/11/chartex" xmlns:cx6="http://schemas.microsoft.com/office/drawing/2016/5/12/chartex" xmlns:cx7="http://schemas.microsoft.com/office/drawing/2016/5/13/chartex" xmlns:cx8="http://schemas.microsoft.com/office/drawing/2016/5/14/chartex" xmlns:mc="http://schemas.openxmlformats.org/markup-compatibility/2006" xmlns:aink="http://schemas.microsoft.com/office/drawing/2016/ink" xmlns:am3d="http://schemas.microsoft.com/office/drawing/2017/model3d" xmlns:o="urn:schemas-microsoft-com:office:office" xmlns:oel="http://schemas.microsoft.com/office/2019/extlst" xmlns:r="http://schemas.openxmlformats.org/officeDocument/2006/relationships" xmlns:m="http://schemas.openxmlformats.org/officeDocument/2006/math" xmlns:v="urn:schemas-microsoft-com:vml" xmlns:wp14="http://schemas.microsoft.com/office/word/2010/wordprocessingDrawing" xmlns:wp="http://schemas.openxmlformats.org/drawingml/2006/wordprocessingDrawing" xmlns:w10="urn:schemas-microsoft-com:office:word" xmlns:w="http://schemas.openxmlformats.org/wordprocessingml/2006/main" xmlns:w14="http://schemas.microsoft.com/office/word/2010/wordml" xmlns:w15="http://schemas.microsoft.com/office/word/2012/wordml" xmlns:w16cex="http://schemas.microsoft.com/office/word/2018/wordml/cex" xmlns:w16cid="http://schemas.microsoft.com/office/word/2016/wordml/cid" xmlns:w16="http://schemas.microsoft.com/office/word/2018/wordml" xmlns:w16sdtdh="http://schemas.microsoft.com/office/word/2020/wordml/sdtdatahash" xmlns:w16se="http://schemas.microsoft.com/office/word/2015/wordml/symex" xmlns:wpg="http://schemas.microsoft.com/office/word/2010/wordprocessingGroup" xmlns:wpi="http://schemas.microsoft.com/office/word/2010/wordprocessingInk" xmlns:wne="http://schemas.microsoft.com/office/word/2006/wordml" xmlns:wps="http://schemas.microsoft.com/office/word/2010/wordprocessingShape" mc:Ignorable="w14 w15 w16se w16cid w16 w16cex w16sdtdh wp14">
+<w:hdr xmlns:wpc="http://schemas.microsoft.com/office/word/2010/wordprocessingCanvas" xmlns:cx="http://schemas.microsoft.com/office/drawing/2014/chartex" xmlns:cx1="http://schemas.microsoft.com/office/drawing/2015/9/8/chartex" xmlns:cx2="http://schemas.microsoft.com/office/drawing/2015/10/21/chartex" xmlns:cx3="http://schemas.microsoft.com/office/drawing/2016/5/9/chartex" xmlns:cx4="http://schemas.microsoft.com/office/drawing/2016/5/10/chartex" xmlns:cx5="http://schemas.microsoft.com/office/drawing/2016/5/11/chartex" xmlns:cx6="http://schemas.microsoft.com/office/drawing/2016/5/12/chartex" xmlns:cx7="http://schemas.microsoft.com/office/drawing/2016/5/13/chartex" xmlns:cx8="http://schemas.microsoft.com/office/drawing/2016/5/14/chartex" xmlns:mc="http://schemas.openxmlformats.org/markup-compatibility/2006" xmlns:aink="http://schemas.microsoft.com/office/drawing/2016/ink" xmlns:am3d="http://schemas.microsoft.com/office/drawing/2017/model3d" xmlns:o="urn:schemas-microsoft-com:office:office" xmlns:oel="http://schemas.microsoft.com/office/2019/extlst" xmlns:r="http://schemas.openxmlformats.org/officeDocument/2006/relationships" xmlns:m="http://schemas.openxmlformats.org/officeDocument/2006/math" xmlns:v="urn:schemas-microsoft-com:vml" xmlns:wp14="http://schemas.microsoft.com/office/word/2010/wordprocessingDrawing" xmlns:wp="http://schemas.openxmlformats.org/drawingml/2006/wordprocessingDrawing" xmlns:w10="urn:schemas-microsoft-com:office:word" xmlns:w="http://schemas.openxmlformats.org/wordprocessingml/2006/main" xmlns:w14="http://schemas.microsoft.com/office/word/2010/wordml" xmlns:w15="http://schemas.microsoft.com/office/word/2012/wordml" xmlns:w16cex="http://schemas.microsoft.com/office/word/2018/wordml/cex" xmlns:w16cid="http://schemas.microsoft.com/office/word/2016/wordml/cid" xmlns:w16="http://schemas.microsoft.com/office/word/2018/wordml" xmlns:w16du="http://schemas.microsoft.com/office/word/2023/wordml/word16du" xmlns:w16sdtdh="http://schemas.microsoft.com/office/word/2020/wordml/sdtdatahash" xmlns:w16sdtfl="http://schemas.microsoft.com/office/word/2024/wordml/sdtformatlock" xmlns:w16se="http://schemas.microsoft.com/office/word/2015/wordml/symex" xmlns:wpg="http://schemas.microsoft.com/office/word/2010/wordprocessingGroup" xmlns:wpi="http://schemas.microsoft.com/office/word/2010/wordprocessingInk" xmlns:wne="http://schemas.microsoft.com/office/word/2006/wordml" xmlns:wps="http://schemas.microsoft.com/office/word/2010/wordprocessingShape" mc:Ignorable="w14 w15 w16se w16cid w16 w16cex w16sdtdh w16sdtfl w16du wp14">
   <w:p>
     <w:pPr>
       <w:pStyle w:val="Header"/>
@@ -31211,7 +32216,7 @@
 </file>
 
 <file path=word/styles.xml><?xml version="1.0" encoding="utf-8"?>
-<w:styles xmlns:mc="http://schemas.openxmlformats.org/markup-compatibility/2006" xmlns:r="http://schemas.openxmlformats.org/officeDocument/2006/relationships" xmlns:w="http://schemas.openxmlformats.org/wordprocessingml/2006/main" xmlns:w14="http://schemas.microsoft.com/office/word/2010/wordml" xmlns:w15="http://schemas.microsoft.com/office/word/2012/wordml" xmlns:w16cex="http://schemas.microsoft.com/office/word/2018/wordml/cex" xmlns:w16cid="http://schemas.microsoft.com/office/word/2016/wordml/cid" xmlns:w16="http://schemas.microsoft.com/office/word/2018/wordml" xmlns:w16sdtdh="http://schemas.microsoft.com/office/word/2020/wordml/sdtdatahash" xmlns:w16se="http://schemas.microsoft.com/office/word/2015/wordml/symex" mc:Ignorable="w14 w15 w16se w16cid w16 w16cex w16sdtdh">
+<w:styles xmlns:mc="http://schemas.openxmlformats.org/markup-compatibility/2006" xmlns:r="http://schemas.openxmlformats.org/officeDocument/2006/relationships" xmlns:w="http://schemas.openxmlformats.org/wordprocessingml/2006/main" xmlns:w14="http://schemas.microsoft.com/office/word/2010/wordml" xmlns:w15="http://schemas.microsoft.com/office/word/2012/wordml" xmlns:w16cex="http://schemas.microsoft.com/office/word/2018/wordml/cex" xmlns:w16cid="http://schemas.microsoft.com/office/word/2016/wordml/cid" xmlns:w16="http://schemas.microsoft.com/office/word/2018/wordml" xmlns:w16du="http://schemas.microsoft.com/office/word/2023/wordml/word16du" xmlns:w16sdtdh="http://schemas.microsoft.com/office/word/2020/wordml/sdtdatahash" xmlns:w16sdtfl="http://schemas.microsoft.com/office/word/2024/wordml/sdtformatlock" xmlns:w16se="http://schemas.microsoft.com/office/word/2015/wordml/symex" mc:Ignorable="w14 w15 w16se w16cid w16 w16cex w16sdtdh w16sdtfl w16du">
   <w:docDefaults>
     <w:rPrDefault>
       <w:rPr>

</xml_diff>